<commit_message>
Code changes to apply the suggestions and add DHT comparisons.
</commit_message>
<xml_diff>
--- a/sdk/cosmos/azure_data_cosmos_benchmarks/docs/PPCB_MEMORY_ANALYSIS.docx
+++ b/sdk/cosmos/azure_data_cosmos_benchmarks/docs/PPCB_MEMORY_ANALYSIS.docx
@@ -91,7 +91,7 @@
         <w:rPr>
           <w:rFonts w:ascii="Courier New" w:hAnsi="Courier New" w:cs="Courier New"/>
         </w:rPr>
-        <w:t>**Status:** Final — measurement complete</w:t>
+        <w:t>**Status:** Final — measurement complete; recommendations applied (§15)</w:t>
       </w:r>
     </w:p>
     <w:p>
@@ -377,6 +377,20 @@
           <w:rFonts w:ascii="Courier New" w:hAnsi="Courier New" w:cs="Courier New"/>
         </w:rPr>
       </w:pPr>
+      <w:r>
+        <w:rPr>
+          <w:rFonts w:ascii="Courier New" w:hAnsi="Courier New" w:cs="Courier New"/>
+        </w:rPr>
+        <w:t>17. [Verified Optimization Results (v2)](#15-verified-optimization-results-v2)</w:t>
+      </w:r>
+    </w:p>
+    <w:p>
+      <w:pPr>
+        <w:pStyle w:val="PlainText"/>
+        <w:rPr>
+          <w:rFonts w:ascii="Courier New" w:hAnsi="Courier New" w:cs="Courier New"/>
+        </w:rPr>
+      </w:pPr>
     </w:p>
     <w:p>
       <w:pPr>
@@ -1295,7 +1309,6 @@
         <w:rPr>
           <w:rFonts w:ascii="Courier New" w:hAnsi="Courier New" w:cs="Courier New"/>
         </w:rPr>
-        <w:lastRenderedPageBreak/>
         <w:t>`(PK-range, region)` pair, and entries are removed during failback. With</w:t>
       </w:r>
     </w:p>
@@ -9674,6 +9687,2554 @@
           <w:rFonts w:ascii="Courier New" w:hAnsi="Courier New" w:cs="Courier New"/>
         </w:rPr>
       </w:pPr>
+    </w:p>
+    <w:p>
+      <w:pPr>
+        <w:pStyle w:val="PlainText"/>
+        <w:rPr>
+          <w:rFonts w:ascii="Courier New" w:hAnsi="Courier New" w:cs="Courier New"/>
+        </w:rPr>
+      </w:pPr>
+    </w:p>
+    <w:p>
+      <w:pPr>
+        <w:pStyle w:val="PlainText"/>
+        <w:rPr>
+          <w:rFonts w:ascii="Courier New" w:hAnsi="Courier New" w:cs="Courier New"/>
+        </w:rPr>
+      </w:pPr>
+      <w:r>
+        <w:rPr>
+          <w:rFonts w:ascii="Courier New" w:hAnsi="Courier New" w:cs="Courier New"/>
+        </w:rPr>
+        <w:t>---</w:t>
+      </w:r>
+    </w:p>
+    <w:p>
+      <w:pPr>
+        <w:pStyle w:val="PlainText"/>
+        <w:rPr>
+          <w:rFonts w:ascii="Courier New" w:hAnsi="Courier New" w:cs="Courier New"/>
+        </w:rPr>
+      </w:pPr>
+    </w:p>
+    <w:p>
+      <w:pPr>
+        <w:pStyle w:val="PlainText"/>
+        <w:rPr>
+          <w:rFonts w:ascii="Courier New" w:hAnsi="Courier New" w:cs="Courier New"/>
+        </w:rPr>
+      </w:pPr>
+      <w:r>
+        <w:rPr>
+          <w:rFonts w:ascii="Courier New" w:hAnsi="Courier New" w:cs="Courier New"/>
+        </w:rPr>
+        <w:t>## 15. Verified Optimization Results (v2)</w:t>
+      </w:r>
+    </w:p>
+    <w:p>
+      <w:pPr>
+        <w:pStyle w:val="PlainText"/>
+        <w:rPr>
+          <w:rFonts w:ascii="Courier New" w:hAnsi="Courier New" w:cs="Courier New"/>
+        </w:rPr>
+      </w:pPr>
+    </w:p>
+    <w:p>
+      <w:pPr>
+        <w:pStyle w:val="PlainText"/>
+        <w:rPr>
+          <w:rFonts w:ascii="Courier New" w:hAnsi="Courier New" w:cs="Courier New"/>
+        </w:rPr>
+      </w:pPr>
+      <w:r>
+        <w:rPr>
+          <w:rFonts w:ascii="Courier New" w:hAnsi="Courier New" w:cs="Courier New"/>
+        </w:rPr>
+        <w:t>This section records the **measured** outcome of applying recommendations</w:t>
+      </w:r>
+    </w:p>
+    <w:p>
+      <w:pPr>
+        <w:pStyle w:val="PlainText"/>
+        <w:rPr>
+          <w:rFonts w:ascii="Courier New" w:hAnsi="Courier New" w:cs="Courier New"/>
+        </w:rPr>
+      </w:pPr>
+      <w:r>
+        <w:rPr>
+          <w:rFonts w:ascii="Courier New" w:hAnsi="Courier New" w:cs="Courier New"/>
+        </w:rPr>
+        <w:t>§11.1 (`SmallVec` for `failed_endpoints`) and §11.2 (`CompactString` for</w:t>
+      </w:r>
+    </w:p>
+    <w:p>
+      <w:pPr>
+        <w:pStyle w:val="PlainText"/>
+        <w:rPr>
+          <w:rFonts w:ascii="Courier New" w:hAnsi="Courier New" w:cs="Courier New"/>
+        </w:rPr>
+      </w:pPr>
+      <w:r>
+        <w:rPr>
+          <w:rFonts w:ascii="Courier New" w:hAnsi="Courier New" w:cs="Courier New"/>
+        </w:rPr>
+        <w:t>`PartitionKeyRangeId`). Both changes shipped in the same patch; results</w:t>
+      </w:r>
+    </w:p>
+    <w:p>
+      <w:pPr>
+        <w:pStyle w:val="PlainText"/>
+        <w:rPr>
+          <w:rFonts w:ascii="Courier New" w:hAnsi="Courier New" w:cs="Courier New"/>
+        </w:rPr>
+      </w:pPr>
+      <w:r>
+        <w:rPr>
+          <w:rFonts w:ascii="Courier New" w:hAnsi="Courier New" w:cs="Courier New"/>
+        </w:rPr>
+        <w:t>below compare the original (v1) against the optimized driver (v2) under</w:t>
+      </w:r>
+    </w:p>
+    <w:p>
+      <w:pPr>
+        <w:pStyle w:val="PlainText"/>
+        <w:rPr>
+          <w:rFonts w:ascii="Courier New" w:hAnsi="Courier New" w:cs="Courier New"/>
+        </w:rPr>
+      </w:pPr>
+      <w:r>
+        <w:rPr>
+          <w:rFonts w:ascii="Courier New" w:hAnsi="Courier New" w:cs="Courier New"/>
+        </w:rPr>
+        <w:t>identical workload (80,000 partitions × 2 failed regions × 4 total</w:t>
+      </w:r>
+    </w:p>
+    <w:p>
+      <w:pPr>
+        <w:pStyle w:val="PlainText"/>
+        <w:rPr>
+          <w:rFonts w:ascii="Courier New" w:hAnsi="Courier New" w:cs="Courier New"/>
+        </w:rPr>
+      </w:pPr>
+      <w:r>
+        <w:rPr>
+          <w:rFonts w:ascii="Courier New" w:hAnsi="Courier New" w:cs="Courier New"/>
+        </w:rPr>
+        <w:t>regions, release build, Windows x86_64).</w:t>
+      </w:r>
+    </w:p>
+    <w:p>
+      <w:pPr>
+        <w:pStyle w:val="PlainText"/>
+        <w:rPr>
+          <w:rFonts w:ascii="Courier New" w:hAnsi="Courier New" w:cs="Courier New"/>
+        </w:rPr>
+      </w:pPr>
+    </w:p>
+    <w:p>
+      <w:pPr>
+        <w:pStyle w:val="PlainText"/>
+        <w:rPr>
+          <w:rFonts w:ascii="Courier New" w:hAnsi="Courier New" w:cs="Courier New"/>
+        </w:rPr>
+      </w:pPr>
+      <w:r>
+        <w:rPr>
+          <w:rFonts w:ascii="Courier New" w:hAnsi="Courier New" w:cs="Courier New"/>
+        </w:rPr>
+        <w:t>### 15.1 Code changes applied</w:t>
+      </w:r>
+    </w:p>
+    <w:p>
+      <w:pPr>
+        <w:pStyle w:val="PlainText"/>
+        <w:rPr>
+          <w:rFonts w:ascii="Courier New" w:hAnsi="Courier New" w:cs="Courier New"/>
+        </w:rPr>
+      </w:pPr>
+    </w:p>
+    <w:p>
+      <w:pPr>
+        <w:pStyle w:val="PlainText"/>
+        <w:rPr>
+          <w:rFonts w:ascii="Courier New" w:hAnsi="Courier New" w:cs="Courier New"/>
+        </w:rPr>
+      </w:pPr>
+      <w:r>
+        <w:rPr>
+          <w:rFonts w:ascii="Courier New" w:hAnsi="Courier New" w:cs="Courier New"/>
+        </w:rPr>
+        <w:t>| File | Change |</w:t>
+      </w:r>
+    </w:p>
+    <w:p>
+      <w:pPr>
+        <w:pStyle w:val="PlainText"/>
+        <w:rPr>
+          <w:rFonts w:ascii="Courier New" w:hAnsi="Courier New" w:cs="Courier New"/>
+        </w:rPr>
+      </w:pPr>
+      <w:r>
+        <w:rPr>
+          <w:rFonts w:ascii="Courier New" w:hAnsi="Courier New" w:cs="Courier New"/>
+        </w:rPr>
+        <w:t>|---|---|</w:t>
+      </w:r>
+    </w:p>
+    <w:p>
+      <w:pPr>
+        <w:pStyle w:val="PlainText"/>
+        <w:rPr>
+          <w:rFonts w:ascii="Courier New" w:hAnsi="Courier New" w:cs="Courier New"/>
+        </w:rPr>
+      </w:pPr>
+      <w:r>
+        <w:rPr>
+          <w:rFonts w:ascii="Courier New" w:hAnsi="Courier New" w:cs="Courier New"/>
+        </w:rPr>
+        <w:t>| `Cargo.toml` (workspace) | Added `smallvec = { version = "1.13", features = ["union"] }` and `compact_str = "0.8"` to `[workspace.dependencies]` |</w:t>
+      </w:r>
+    </w:p>
+    <w:p>
+      <w:pPr>
+        <w:pStyle w:val="PlainText"/>
+        <w:rPr>
+          <w:rFonts w:ascii="Courier New" w:hAnsi="Courier New" w:cs="Courier New"/>
+        </w:rPr>
+      </w:pPr>
+      <w:r>
+        <w:rPr>
+          <w:rFonts w:ascii="Courier New" w:hAnsi="Courier New" w:cs="Courier New"/>
+        </w:rPr>
+        <w:t>| `azure_data_cosmos_driver/Cargo.toml` | Added `smallvec.workspace = true` and `compact_str.workspace = true` |</w:t>
+      </w:r>
+    </w:p>
+    <w:p>
+      <w:pPr>
+        <w:pStyle w:val="PlainText"/>
+        <w:rPr>
+          <w:rFonts w:ascii="Courier New" w:hAnsi="Courier New" w:cs="Courier New"/>
+        </w:rPr>
+      </w:pPr>
+      <w:r>
+        <w:rPr>
+          <w:rFonts w:ascii="Courier New" w:hAnsi="Courier New" w:cs="Courier New"/>
+        </w:rPr>
+        <w:t>| `partition_endpoint_state.rs` | New `pub type FailedEndpoints = SmallVec&lt;[CosmosEndpoint; 4]&gt;;` alias. `PartitionFailoverEntry::failed_endpoints` switched from `HashSet&lt;CosmosEndpoint&gt;` to `FailedEndpoints` |</w:t>
+      </w:r>
+    </w:p>
+    <w:p>
+      <w:pPr>
+        <w:pStyle w:val="PlainText"/>
+        <w:rPr>
+          <w:rFonts w:ascii="Courier New" w:hAnsi="Courier New" w:cs="Courier New"/>
+        </w:rPr>
+      </w:pPr>
+      <w:r>
+        <w:rPr>
+          <w:rFonts w:ascii="Courier New" w:hAnsi="Courier New" w:cs="Courier New"/>
+        </w:rPr>
+        <w:t>| `partition_key_range_id.rs` | Inner `String` replaced with `CompactString`; added `From&lt;&amp;str&gt;`; all accessors updated to `self.0.as_str()` |</w:t>
+      </w:r>
+    </w:p>
+    <w:p>
+      <w:pPr>
+        <w:pStyle w:val="PlainText"/>
+        <w:rPr>
+          <w:rFonts w:ascii="Courier New" w:hAnsi="Courier New" w:cs="Courier New"/>
+        </w:rPr>
+      </w:pPr>
+      <w:r>
+        <w:rPr>
+          <w:rFonts w:ascii="Courier New" w:hAnsi="Courier New" w:cs="Courier New"/>
+        </w:rPr>
+        <w:t>| `routing_systems.rs` | `try_move_next_endpoint` rewritten to use `if !contains { push }` instead of `HashSet::insert`. Two test sites use `smallvec![…]` literal in place of `HashSet::insert(…)` |</w:t>
+      </w:r>
+    </w:p>
+    <w:p>
+      <w:pPr>
+        <w:pStyle w:val="PlainText"/>
+        <w:rPr>
+          <w:rFonts w:ascii="Courier New" w:hAnsi="Courier New" w:cs="Courier New"/>
+        </w:rPr>
+      </w:pPr>
+      <w:r>
+        <w:rPr>
+          <w:rFonts w:ascii="Courier New" w:hAnsi="Courier New" w:cs="Courier New"/>
+        </w:rPr>
+        <w:t>| `testing.rs` | Re-exported the new `FailedEndpoints` alias under `__internal_testing` |</w:t>
+      </w:r>
+    </w:p>
+    <w:p>
+      <w:pPr>
+        <w:pStyle w:val="PlainText"/>
+        <w:rPr>
+          <w:rFonts w:ascii="Courier New" w:hAnsi="Courier New" w:cs="Courier New"/>
+        </w:rPr>
+      </w:pPr>
+      <w:r>
+        <w:rPr>
+          <w:rFonts w:ascii="Courier New" w:hAnsi="Courier New" w:cs="Courier New"/>
+        </w:rPr>
+        <w:t>| `examples/ppcb_state_dhat.rs` | Imports `FailedEndpoints` from `azure_data_cosmos_driver::testing`; populates the field via `iter().cloned().collect::&lt;FailedEndpoints&gt;()` |</w:t>
+      </w:r>
+    </w:p>
+    <w:p>
+      <w:pPr>
+        <w:pStyle w:val="PlainText"/>
+        <w:rPr>
+          <w:rFonts w:ascii="Courier New" w:hAnsi="Courier New" w:cs="Courier New"/>
+        </w:rPr>
+      </w:pPr>
+    </w:p>
+    <w:p>
+      <w:pPr>
+        <w:pStyle w:val="PlainText"/>
+        <w:rPr>
+          <w:rFonts w:ascii="Courier New" w:hAnsi="Courier New" w:cs="Courier New"/>
+        </w:rPr>
+      </w:pPr>
+      <w:r>
+        <w:rPr>
+          <w:rFonts w:ascii="Courier New" w:hAnsi="Courier New" w:cs="Courier New"/>
+        </w:rPr>
+        <w:t>The `union` feature of `smallvec` was selected deliberately: without it</w:t>
+      </w:r>
+    </w:p>
+    <w:p>
+      <w:pPr>
+        <w:pStyle w:val="PlainText"/>
+        <w:rPr>
+          <w:rFonts w:ascii="Courier New" w:hAnsi="Courier New" w:cs="Courier New"/>
+        </w:rPr>
+      </w:pPr>
+      <w:r>
+        <w:rPr>
+          <w:rFonts w:ascii="Courier New" w:hAnsi="Courier New" w:cs="Courier New"/>
+        </w:rPr>
+        <w:t>the inline storage and the heap pointer/capacity sit in separate fields</w:t>
+      </w:r>
+    </w:p>
+    <w:p>
+      <w:pPr>
+        <w:pStyle w:val="PlainText"/>
+        <w:rPr>
+          <w:rFonts w:ascii="Courier New" w:hAnsi="Courier New" w:cs="Courier New"/>
+        </w:rPr>
+      </w:pPr>
+      <w:r>
+        <w:rPr>
+          <w:rFonts w:ascii="Courier New" w:hAnsi="Courier New" w:cs="Courier New"/>
+        </w:rPr>
+        <w:t>(56 B for `SmallVec&lt;[CosmosEndpoint; 4]&gt;`); with `union` they overlap</w:t>
+      </w:r>
+    </w:p>
+    <w:p>
+      <w:pPr>
+        <w:pStyle w:val="PlainText"/>
+        <w:rPr>
+          <w:rFonts w:ascii="Courier New" w:hAnsi="Courier New" w:cs="Courier New"/>
+        </w:rPr>
+      </w:pPr>
+      <w:r>
+        <w:rPr>
+          <w:rFonts w:ascii="Courier New" w:hAnsi="Courier New" w:cs="Courier New"/>
+        </w:rPr>
+        <w:t>in a `MaybeUninit` union (40 B). `union` is well-tested upstream and</w:t>
+      </w:r>
+    </w:p>
+    <w:p>
+      <w:pPr>
+        <w:pStyle w:val="PlainText"/>
+        <w:rPr>
+          <w:rFonts w:ascii="Courier New" w:hAnsi="Courier New" w:cs="Courier New"/>
+        </w:rPr>
+      </w:pPr>
+      <w:r>
+        <w:rPr>
+          <w:rFonts w:ascii="Courier New" w:hAnsi="Courier New" w:cs="Courier New"/>
+        </w:rPr>
+        <w:t>documented as production-grade since `smallvec 1.0`.</w:t>
+      </w:r>
+    </w:p>
+    <w:p>
+      <w:pPr>
+        <w:pStyle w:val="PlainText"/>
+        <w:rPr>
+          <w:rFonts w:ascii="Courier New" w:hAnsi="Courier New" w:cs="Courier New"/>
+        </w:rPr>
+      </w:pPr>
+    </w:p>
+    <w:p>
+      <w:pPr>
+        <w:pStyle w:val="PlainText"/>
+        <w:rPr>
+          <w:rFonts w:ascii="Courier New" w:hAnsi="Courier New" w:cs="Courier New"/>
+        </w:rPr>
+      </w:pPr>
+      <w:r>
+        <w:rPr>
+          <w:rFonts w:ascii="Courier New" w:hAnsi="Courier New" w:cs="Courier New"/>
+        </w:rPr>
+        <w:t>### 15.2 Validation</w:t>
+      </w:r>
+    </w:p>
+    <w:p>
+      <w:pPr>
+        <w:pStyle w:val="PlainText"/>
+        <w:rPr>
+          <w:rFonts w:ascii="Courier New" w:hAnsi="Courier New" w:cs="Courier New"/>
+        </w:rPr>
+      </w:pPr>
+    </w:p>
+    <w:p>
+      <w:pPr>
+        <w:pStyle w:val="PlainText"/>
+        <w:rPr>
+          <w:rFonts w:ascii="Courier New" w:hAnsi="Courier New" w:cs="Courier New"/>
+        </w:rPr>
+      </w:pPr>
+      <w:r>
+        <w:rPr>
+          <w:rFonts w:ascii="Courier New" w:hAnsi="Courier New" w:cs="Courier New"/>
+        </w:rPr>
+        <w:t>- `cargo build -p azure_data_cosmos_driver --features __internal_testing` — clean.</w:t>
+      </w:r>
+    </w:p>
+    <w:p>
+      <w:pPr>
+        <w:pStyle w:val="PlainText"/>
+        <w:rPr>
+          <w:rFonts w:ascii="Courier New" w:hAnsi="Courier New" w:cs="Courier New"/>
+        </w:rPr>
+      </w:pPr>
+      <w:r>
+        <w:rPr>
+          <w:rFonts w:ascii="Courier New" w:hAnsi="Courier New" w:cs="Courier New"/>
+        </w:rPr>
+        <w:t>- `cargo build -p azure_data_cosmos_driver --all-features --tests` — clean.</w:t>
+      </w:r>
+    </w:p>
+    <w:p>
+      <w:pPr>
+        <w:pStyle w:val="PlainText"/>
+        <w:rPr>
+          <w:rFonts w:ascii="Courier New" w:hAnsi="Courier New" w:cs="Courier New"/>
+        </w:rPr>
+      </w:pPr>
+      <w:r>
+        <w:rPr>
+          <w:rFonts w:ascii="Courier New" w:hAnsi="Courier New" w:cs="Courier New"/>
+        </w:rPr>
+        <w:t>- `cargo clippy -p azure_data_cosmos_driver --all-features --all-targets` — clean (only the pre-existing `PartitionKeyRangeCache::new` `clippy::new_without_default` warning unrelated to this change).</w:t>
+      </w:r>
+    </w:p>
+    <w:p>
+      <w:pPr>
+        <w:pStyle w:val="PlainText"/>
+        <w:rPr>
+          <w:rFonts w:ascii="Courier New" w:hAnsi="Courier New" w:cs="Courier New"/>
+        </w:rPr>
+      </w:pPr>
+      <w:r>
+        <w:rPr>
+          <w:rFonts w:ascii="Courier New" w:hAnsi="Courier New" w:cs="Courier New"/>
+        </w:rPr>
+        <w:t>- `cargo test -p azure_data_cosmos_driver --lib routing_systems` — **41 / 41 passed.** Notably `mark_partition_unavailable_all_endpoints_exhausted_removes_entry` and `probe_failure_transitions_back_to_unhealthy` (the only two tests directly exercising `failed_endpoints`) both pass.</w:t>
+      </w:r>
+    </w:p>
+    <w:p>
+      <w:pPr>
+        <w:pStyle w:val="PlainText"/>
+        <w:rPr>
+          <w:rFonts w:ascii="Courier New" w:hAnsi="Courier New" w:cs="Courier New"/>
+        </w:rPr>
+      </w:pPr>
+      <w:r>
+        <w:rPr>
+          <w:rFonts w:ascii="Courier New" w:hAnsi="Courier New" w:cs="Courier New"/>
+        </w:rPr>
+        <w:t>- `cargo build -p azure_data_cosmos_benchmarks --release --features dhat-heap --example ppcb_state_dhat` — clean.</w:t>
+      </w:r>
+    </w:p>
+    <w:p>
+      <w:pPr>
+        <w:pStyle w:val="PlainText"/>
+        <w:rPr>
+          <w:rFonts w:ascii="Courier New" w:hAnsi="Courier New" w:cs="Courier New"/>
+        </w:rPr>
+      </w:pPr>
+    </w:p>
+    <w:p>
+      <w:pPr>
+        <w:pStyle w:val="PlainText"/>
+        <w:rPr>
+          <w:rFonts w:ascii="Courier New" w:hAnsi="Courier New" w:cs="Courier New"/>
+        </w:rPr>
+      </w:pPr>
+      <w:r>
+        <w:rPr>
+          <w:rFonts w:ascii="Courier New" w:hAnsi="Courier New" w:cs="Courier New"/>
+        </w:rPr>
+        <w:t>### 15.3 Type-size impact</w:t>
+      </w:r>
+    </w:p>
+    <w:p>
+      <w:pPr>
+        <w:pStyle w:val="PlainText"/>
+        <w:rPr>
+          <w:rFonts w:ascii="Courier New" w:hAnsi="Courier New" w:cs="Courier New"/>
+        </w:rPr>
+      </w:pPr>
+    </w:p>
+    <w:p>
+      <w:pPr>
+        <w:pStyle w:val="PlainText"/>
+        <w:rPr>
+          <w:rFonts w:ascii="Courier New" w:hAnsi="Courier New" w:cs="Courier New"/>
+        </w:rPr>
+      </w:pPr>
+      <w:r>
+        <w:rPr>
+          <w:rFonts w:ascii="Courier New" w:hAnsi="Courier New" w:cs="Courier New"/>
+        </w:rPr>
+        <w:t>| Type | v1 size | v2 size | Δ |</w:t>
+      </w:r>
+    </w:p>
+    <w:p>
+      <w:pPr>
+        <w:pStyle w:val="PlainText"/>
+        <w:rPr>
+          <w:rFonts w:ascii="Courier New" w:hAnsi="Courier New" w:cs="Courier New"/>
+        </w:rPr>
+      </w:pPr>
+      <w:r>
+        <w:rPr>
+          <w:rFonts w:ascii="Courier New" w:hAnsi="Courier New" w:cs="Courier New"/>
+        </w:rPr>
+        <w:t>|---|---:|---:|---:|</w:t>
+      </w:r>
+    </w:p>
+    <w:p>
+      <w:pPr>
+        <w:pStyle w:val="PlainText"/>
+        <w:rPr>
+          <w:rFonts w:ascii="Courier New" w:hAnsi="Courier New" w:cs="Courier New"/>
+        </w:rPr>
+      </w:pPr>
+      <w:r>
+        <w:rPr>
+          <w:rFonts w:ascii="Courier New" w:hAnsi="Courier New" w:cs="Courier New"/>
+        </w:rPr>
+        <w:t>| `PartitionEndpointState` | 168 B | 168 B | 0 |</w:t>
+      </w:r>
+    </w:p>
+    <w:p>
+      <w:pPr>
+        <w:pStyle w:val="PlainText"/>
+        <w:rPr>
+          <w:rFonts w:ascii="Courier New" w:hAnsi="Courier New" w:cs="Courier New"/>
+        </w:rPr>
+      </w:pPr>
+      <w:r>
+        <w:rPr>
+          <w:rFonts w:ascii="Courier New" w:hAnsi="Courier New" w:cs="Courier New"/>
+        </w:rPr>
+        <w:t>| `PartitionFailoverEntry` | 128 B | **120 B** | **−8 B** |</w:t>
+      </w:r>
+    </w:p>
+    <w:p>
+      <w:pPr>
+        <w:pStyle w:val="PlainText"/>
+        <w:rPr>
+          <w:rFonts w:ascii="Courier New" w:hAnsi="Courier New" w:cs="Courier New"/>
+        </w:rPr>
+      </w:pPr>
+      <w:r>
+        <w:rPr>
+          <w:rFonts w:ascii="Courier New" w:hAnsi="Courier New" w:cs="Courier New"/>
+        </w:rPr>
+        <w:t>| `PartitionFailoverConfig` | 64 B | 64 B | 0 |</w:t>
+      </w:r>
+    </w:p>
+    <w:p>
+      <w:pPr>
+        <w:pStyle w:val="PlainText"/>
+        <w:rPr>
+          <w:rFonts w:ascii="Courier New" w:hAnsi="Courier New" w:cs="Courier New"/>
+        </w:rPr>
+      </w:pPr>
+      <w:r>
+        <w:rPr>
+          <w:rFonts w:ascii="Courier New" w:hAnsi="Courier New" w:cs="Courier New"/>
+        </w:rPr>
+        <w:t>| `PartitionKeyRangeId` | 24 B | 24 B | 0 |</w:t>
+      </w:r>
+    </w:p>
+    <w:p>
+      <w:pPr>
+        <w:pStyle w:val="PlainText"/>
+        <w:rPr>
+          <w:rFonts w:ascii="Courier New" w:hAnsi="Courier New" w:cs="Courier New"/>
+        </w:rPr>
+      </w:pPr>
+      <w:r>
+        <w:rPr>
+          <w:rFonts w:ascii="Courier New" w:hAnsi="Courier New" w:cs="Courier New"/>
+        </w:rPr>
+        <w:t>| `CosmosEndpoint` | 8 B | 8 B | 0 |</w:t>
+      </w:r>
+    </w:p>
+    <w:p>
+      <w:pPr>
+        <w:pStyle w:val="PlainText"/>
+        <w:rPr>
+          <w:rFonts w:ascii="Courier New" w:hAnsi="Courier New" w:cs="Courier New"/>
+        </w:rPr>
+      </w:pPr>
+    </w:p>
+    <w:p>
+      <w:pPr>
+        <w:pStyle w:val="PlainText"/>
+        <w:rPr>
+          <w:rFonts w:ascii="Courier New" w:hAnsi="Courier New" w:cs="Courier New"/>
+        </w:rPr>
+      </w:pPr>
+      <w:r>
+        <w:rPr>
+          <w:rFonts w:ascii="Courier New" w:hAnsi="Courier New" w:cs="Courier New"/>
+        </w:rPr>
+        <w:t>`PartitionFailoverEntry` shrank by 8 B because `SmallVec&lt;[T; 4]&gt;` with</w:t>
+      </w:r>
+    </w:p>
+    <w:p>
+      <w:pPr>
+        <w:pStyle w:val="PlainText"/>
+        <w:rPr>
+          <w:rFonts w:ascii="Courier New" w:hAnsi="Courier New" w:cs="Courier New"/>
+        </w:rPr>
+      </w:pPr>
+      <w:r>
+        <w:rPr>
+          <w:rFonts w:ascii="Courier New" w:hAnsi="Courier New" w:cs="Courier New"/>
+        </w:rPr>
+        <w:t>the `union` feature is **smaller** than the previous `HashSet&lt;T&gt;`</w:t>
+      </w:r>
+    </w:p>
+    <w:p>
+      <w:pPr>
+        <w:pStyle w:val="PlainText"/>
+        <w:rPr>
+          <w:rFonts w:ascii="Courier New" w:hAnsi="Courier New" w:cs="Courier New"/>
+        </w:rPr>
+      </w:pPr>
+      <w:r>
+        <w:rPr>
+          <w:rFonts w:ascii="Courier New" w:hAnsi="Courier New" w:cs="Courier New"/>
+        </w:rPr>
+        <w:t>(40 B vs. 48 B for `T = CosmosEndpoint`). `CompactString` is the same</w:t>
+      </w:r>
+    </w:p>
+    <w:p>
+      <w:pPr>
+        <w:pStyle w:val="PlainText"/>
+        <w:rPr>
+          <w:rFonts w:ascii="Courier New" w:hAnsi="Courier New" w:cs="Courier New"/>
+        </w:rPr>
+      </w:pPr>
+      <w:r>
+        <w:rPr>
+          <w:rFonts w:ascii="Courier New" w:hAnsi="Courier New" w:cs="Courier New"/>
+        </w:rPr>
+        <w:t>inline size as `String` on 64-bit (24 B), so `PartitionKeyRangeId` is</w:t>
+      </w:r>
+    </w:p>
+    <w:p>
+      <w:pPr>
+        <w:pStyle w:val="PlainText"/>
+        <w:rPr>
+          <w:rFonts w:ascii="Courier New" w:hAnsi="Courier New" w:cs="Courier New"/>
+        </w:rPr>
+      </w:pPr>
+      <w:r>
+        <w:rPr>
+          <w:rFonts w:ascii="Courier New" w:hAnsi="Courier New" w:cs="Courier New"/>
+        </w:rPr>
+        <w:t>unchanged.</w:t>
+      </w:r>
+    </w:p>
+    <w:p>
+      <w:pPr>
+        <w:pStyle w:val="PlainText"/>
+        <w:rPr>
+          <w:rFonts w:ascii="Courier New" w:hAnsi="Courier New" w:cs="Courier New"/>
+        </w:rPr>
+      </w:pPr>
+    </w:p>
+    <w:p>
+      <w:pPr>
+        <w:pStyle w:val="PlainText"/>
+        <w:rPr>
+          <w:rFonts w:ascii="Courier New" w:hAnsi="Courier New" w:cs="Courier New"/>
+        </w:rPr>
+      </w:pPr>
+      <w:r>
+        <w:rPr>
+          <w:rFonts w:ascii="Courier New" w:hAnsi="Courier New" w:cs="Courier New"/>
+        </w:rPr>
+        <w:t>This per-slot reduction has a multiplicative effect on the main</w:t>
+      </w:r>
+    </w:p>
+    <w:p>
+      <w:pPr>
+        <w:pStyle w:val="PlainText"/>
+        <w:rPr>
+          <w:rFonts w:ascii="Courier New" w:hAnsi="Courier New" w:cs="Courier New"/>
+        </w:rPr>
+      </w:pPr>
+      <w:r>
+        <w:rPr>
+          <w:rFonts w:ascii="Courier New" w:hAnsi="Courier New" w:cs="Courier New"/>
+        </w:rPr>
+        <w:t>HashMap backing array: 8 B × 131,072 reserved slots = exactly **1 MiB**</w:t>
+      </w:r>
+    </w:p>
+    <w:p>
+      <w:pPr>
+        <w:pStyle w:val="PlainText"/>
+        <w:rPr>
+          <w:rFonts w:ascii="Courier New" w:hAnsi="Courier New" w:cs="Courier New"/>
+        </w:rPr>
+      </w:pPr>
+      <w:r>
+        <w:rPr>
+          <w:rFonts w:ascii="Courier New" w:hAnsi="Courier New" w:cs="Courier New"/>
+        </w:rPr>
+        <w:t>saved on PP9 alone (see §15.5).</w:t>
+      </w:r>
+    </w:p>
+    <w:p>
+      <w:pPr>
+        <w:pStyle w:val="PlainText"/>
+        <w:rPr>
+          <w:rFonts w:ascii="Courier New" w:hAnsi="Courier New" w:cs="Courier New"/>
+        </w:rPr>
+      </w:pPr>
+    </w:p>
+    <w:p>
+      <w:pPr>
+        <w:pStyle w:val="PlainText"/>
+        <w:rPr>
+          <w:rFonts w:ascii="Courier New" w:hAnsi="Courier New" w:cs="Courier New"/>
+        </w:rPr>
+      </w:pPr>
+      <w:r>
+        <w:rPr>
+          <w:rFonts w:ascii="Courier New" w:hAnsi="Courier New" w:cs="Courier New"/>
+        </w:rPr>
+        <w:t>### 15.4 Headline comparison (DHAT totals)</w:t>
+      </w:r>
+    </w:p>
+    <w:p>
+      <w:pPr>
+        <w:pStyle w:val="PlainText"/>
+        <w:rPr>
+          <w:rFonts w:ascii="Courier New" w:hAnsi="Courier New" w:cs="Courier New"/>
+        </w:rPr>
+      </w:pPr>
+    </w:p>
+    <w:p>
+      <w:pPr>
+        <w:pStyle w:val="PlainText"/>
+        <w:rPr>
+          <w:rFonts w:ascii="Courier New" w:hAnsi="Courier New" w:cs="Courier New"/>
+        </w:rPr>
+      </w:pPr>
+      <w:r>
+        <w:rPr>
+          <w:rFonts w:ascii="Courier New" w:hAnsi="Courier New" w:cs="Courier New"/>
+        </w:rPr>
+        <w:t>| Metric | v1 (original) | v2 (optimized) | Δ | % change |</w:t>
+      </w:r>
+    </w:p>
+    <w:p>
+      <w:pPr>
+        <w:pStyle w:val="PlainText"/>
+        <w:rPr>
+          <w:rFonts w:ascii="Courier New" w:hAnsi="Courier New" w:cs="Courier New"/>
+        </w:rPr>
+      </w:pPr>
+      <w:r>
+        <w:rPr>
+          <w:rFonts w:ascii="Courier New" w:hAnsi="Courier New" w:cs="Courier New"/>
+        </w:rPr>
+        <w:t>|---|---:|---:|---:|---:|</w:t>
+      </w:r>
+    </w:p>
+    <w:p>
+      <w:pPr>
+        <w:pStyle w:val="PlainText"/>
+        <w:rPr>
+          <w:rFonts w:ascii="Courier New" w:hAnsi="Courier New" w:cs="Courier New"/>
+        </w:rPr>
+      </w:pPr>
+      <w:r>
+        <w:rPr>
+          <w:rFonts w:ascii="Courier New" w:hAnsi="Courier New" w:cs="Courier New"/>
+        </w:rPr>
+        <w:t>| **Peak live bytes** (`t-gmax`) | 24,604,302 | **19,006,841** | **−5,597,461** (≈ −5.34 MiB) | **−22.75 %** |</w:t>
+      </w:r>
+    </w:p>
+    <w:p>
+      <w:pPr>
+        <w:pStyle w:val="PlainText"/>
+        <w:rPr>
+          <w:rFonts w:ascii="Courier New" w:hAnsi="Courier New" w:cs="Courier New"/>
+        </w:rPr>
+      </w:pPr>
+      <w:r>
+        <w:rPr>
+          <w:rFonts w:ascii="Courier New" w:hAnsi="Courier New" w:cs="Courier New"/>
+        </w:rPr>
+        <w:t>| **Peak live blocks** (`t-gmax`) | 160,014 | **15** | **−159,999** | **−99.99 %** |</w:t>
+      </w:r>
+    </w:p>
+    <w:p>
+      <w:pPr>
+        <w:pStyle w:val="PlainText"/>
+        <w:rPr>
+          <w:rFonts w:ascii="Courier New" w:hAnsi="Courier New" w:cs="Courier New"/>
+        </w:rPr>
+      </w:pPr>
+      <w:r>
+        <w:rPr>
+          <w:rFonts w:ascii="Courier New" w:hAnsi="Courier New" w:cs="Courier New"/>
+        </w:rPr>
+        <w:t>| Total bytes allocated (lifetime) | 24,994,000 | 19,396,534 | −5,597,466 | −22.40 % |</w:t>
+      </w:r>
+    </w:p>
+    <w:p>
+      <w:pPr>
+        <w:pStyle w:val="PlainText"/>
+        <w:rPr>
+          <w:rFonts w:ascii="Courier New" w:hAnsi="Courier New" w:cs="Courier New"/>
+        </w:rPr>
+      </w:pPr>
+      <w:r>
+        <w:rPr>
+          <w:rFonts w:ascii="Courier New" w:hAnsi="Courier New" w:cs="Courier New"/>
+        </w:rPr>
+        <w:t>| Total alloc events | 240,026 | 80,026 | −160,000 | −66.66 % |</w:t>
+      </w:r>
+    </w:p>
+    <w:p>
+      <w:pPr>
+        <w:pStyle w:val="PlainText"/>
+        <w:rPr>
+          <w:rFonts w:ascii="Courier New" w:hAnsi="Courier New" w:cs="Courier New"/>
+        </w:rPr>
+      </w:pPr>
+      <w:r>
+        <w:rPr>
+          <w:rFonts w:ascii="Courier New" w:hAnsi="Courier New" w:cs="Courier New"/>
+        </w:rPr>
+        <w:t>| Leaked bytes / blocks | 0 / 0 | 0 / 0 | 0 / 0 | — |</w:t>
+      </w:r>
+    </w:p>
+    <w:p>
+      <w:pPr>
+        <w:pStyle w:val="PlainText"/>
+        <w:rPr>
+          <w:rFonts w:ascii="Courier New" w:hAnsi="Courier New" w:cs="Courier New"/>
+        </w:rPr>
+      </w:pPr>
+      <w:r>
+        <w:rPr>
+          <w:rFonts w:ascii="Courier New" w:hAnsi="Courier New" w:cs="Courier New"/>
+        </w:rPr>
+        <w:t>| **Bytes per partition entry** | 308 | **~237.5** | **−70.5** | **−22.9 %** |</w:t>
+      </w:r>
+    </w:p>
+    <w:p>
+      <w:pPr>
+        <w:pStyle w:val="PlainText"/>
+        <w:rPr>
+          <w:rFonts w:ascii="Courier New" w:hAnsi="Courier New" w:cs="Courier New"/>
+        </w:rPr>
+      </w:pPr>
+      <w:r>
+        <w:rPr>
+          <w:rFonts w:ascii="Courier New" w:hAnsi="Courier New" w:cs="Courier New"/>
+        </w:rPr>
+        <w:t>| **Blocks per partition entry** | 2 | **0** | **−2** | **−100 %** |</w:t>
+      </w:r>
+    </w:p>
+    <w:p>
+      <w:pPr>
+        <w:pStyle w:val="PlainText"/>
+        <w:rPr>
+          <w:rFonts w:ascii="Courier New" w:hAnsi="Courier New" w:cs="Courier New"/>
+        </w:rPr>
+      </w:pPr>
+    </w:p>
+    <w:p>
+      <w:pPr>
+        <w:pStyle w:val="PlainText"/>
+        <w:rPr>
+          <w:rFonts w:ascii="Courier New" w:hAnsi="Courier New" w:cs="Courier New"/>
+        </w:rPr>
+      </w:pPr>
+      <w:r>
+        <w:rPr>
+          <w:rFonts w:ascii="Courier New" w:hAnsi="Courier New" w:cs="Courier New"/>
+        </w:rPr>
+        <w:t>The disabled-mode trace is **identical** between v1 and v2</w:t>
+      </w:r>
+    </w:p>
+    <w:p>
+      <w:pPr>
+        <w:pStyle w:val="PlainText"/>
+        <w:rPr>
+          <w:rFonts w:ascii="Courier New" w:hAnsi="Courier New" w:cs="Courier New"/>
+        </w:rPr>
+      </w:pPr>
+      <w:r>
+        <w:rPr>
+          <w:rFonts w:ascii="Courier New" w:hAnsi="Courier New" w:cs="Courier New"/>
+        </w:rPr>
+        <w:t>(1,380 B / 13 blocks at peak), confirming that the optimization adds</w:t>
+      </w:r>
+    </w:p>
+    <w:p>
+      <w:pPr>
+        <w:pStyle w:val="PlainText"/>
+        <w:rPr>
+          <w:rFonts w:ascii="Courier New" w:hAnsi="Courier New" w:cs="Courier New"/>
+        </w:rPr>
+      </w:pPr>
+      <w:r>
+        <w:rPr>
+          <w:rFonts w:ascii="Courier New" w:hAnsi="Courier New" w:cs="Courier New"/>
+        </w:rPr>
+        <w:t>no regression for accounts that never trip the circuit breaker.</w:t>
+      </w:r>
+    </w:p>
+    <w:p>
+      <w:pPr>
+        <w:pStyle w:val="PlainText"/>
+        <w:rPr>
+          <w:rFonts w:ascii="Courier New" w:hAnsi="Courier New" w:cs="Courier New"/>
+        </w:rPr>
+      </w:pPr>
+    </w:p>
+    <w:p>
+      <w:pPr>
+        <w:pStyle w:val="PlainText"/>
+        <w:rPr>
+          <w:rFonts w:ascii="Courier New" w:hAnsi="Courier New" w:cs="Courier New"/>
+        </w:rPr>
+      </w:pPr>
+      <w:r>
+        <w:rPr>
+          <w:rFonts w:ascii="Courier New" w:hAnsi="Courier New" w:cs="Courier New"/>
+        </w:rPr>
+        <w:t>### 15.5 Per-allocation comparison (enabled mode)</w:t>
+      </w:r>
+    </w:p>
+    <w:p>
+      <w:pPr>
+        <w:pStyle w:val="PlainText"/>
+        <w:rPr>
+          <w:rFonts w:ascii="Courier New" w:hAnsi="Courier New" w:cs="Courier New"/>
+        </w:rPr>
+      </w:pPr>
+    </w:p>
+    <w:p>
+      <w:pPr>
+        <w:pStyle w:val="PlainText"/>
+        <w:rPr>
+          <w:rFonts w:ascii="Courier New" w:hAnsi="Courier New" w:cs="Courier New"/>
+        </w:rPr>
+      </w:pPr>
+      <w:r>
+        <w:rPr>
+          <w:rFonts w:ascii="Courier New" w:hAnsi="Courier New" w:cs="Courier New"/>
+        </w:rPr>
+        <w:t>| PP | Origin | v1 live B | v1 blocks | v2 live B | v2 blocks | Δ bytes | Δ blocks |</w:t>
+      </w:r>
+    </w:p>
+    <w:p>
+      <w:pPr>
+        <w:pStyle w:val="PlainText"/>
+        <w:rPr>
+          <w:rFonts w:ascii="Courier New" w:hAnsi="Courier New" w:cs="Courier New"/>
+        </w:rPr>
+      </w:pPr>
+      <w:r>
+        <w:rPr>
+          <w:rFonts w:ascii="Courier New" w:hAnsi="Courier New" w:cs="Courier New"/>
+        </w:rPr>
+        <w:t>|---:|---|---:|---:|---:|---:|---:|---:|</w:t>
+      </w:r>
+    </w:p>
+    <w:p>
+      <w:pPr>
+        <w:pStyle w:val="PlainText"/>
+        <w:rPr>
+          <w:rFonts w:ascii="Courier New" w:hAnsi="Courier New" w:cs="Courier New"/>
+        </w:rPr>
+      </w:pPr>
+      <w:r>
+        <w:rPr>
+          <w:rFonts w:ascii="Courier New" w:hAnsi="Courier New" w:cs="Courier New"/>
+        </w:rPr>
+        <w:t>| Main HashMap backing | `circuit_breaker_overrides` table | 20,054,032 | 1 | **19,005,456** | 1 | **−1,048,576** (−1.00 MiB) | 0 |</w:t>
+      </w:r>
+    </w:p>
+    <w:p>
+      <w:pPr>
+        <w:pStyle w:val="PlainText"/>
+        <w:rPr>
+          <w:rFonts w:ascii="Courier New" w:hAnsi="Courier New" w:cs="Courier New"/>
+        </w:rPr>
+      </w:pPr>
+      <w:r>
+        <w:rPr>
+          <w:rFonts w:ascii="Courier New" w:hAnsi="Courier New" w:cs="Courier New"/>
+        </w:rPr>
+        <w:t>| Per-entry `failed_endpoints` HashSet | `RawTable::with_capacity_in` | 4,160,000 | 80,000 | **0** | **0** | **−4,160,000** (−3.97 MiB) | **−80,000** |</w:t>
+      </w:r>
+    </w:p>
+    <w:p>
+      <w:pPr>
+        <w:pStyle w:val="PlainText"/>
+        <w:rPr>
+          <w:rFonts w:ascii="Courier New" w:hAnsi="Courier New" w:cs="Courier New"/>
+        </w:rPr>
+      </w:pPr>
+      <w:r>
+        <w:rPr>
+          <w:rFonts w:ascii="Courier New" w:hAnsi="Courier New" w:cs="Courier New"/>
+        </w:rPr>
+        <w:t>| Per-entry `PartitionKeyRangeId` String | `String::with_capacity` | 388,890 | 80,000 | **5** | **1** | **−388,885** | **−79,999** |</w:t>
+      </w:r>
+    </w:p>
+    <w:p>
+      <w:pPr>
+        <w:pStyle w:val="PlainText"/>
+        <w:rPr>
+          <w:rFonts w:ascii="Courier New" w:hAnsi="Courier New" w:cs="Courier New"/>
+        </w:rPr>
+      </w:pPr>
+      <w:r>
+        <w:rPr>
+          <w:rFonts w:ascii="Courier New" w:hAnsi="Courier New" w:cs="Courier New"/>
+        </w:rPr>
+        <w:t>| 4× `EndpointKey` Arc payload | `CosmosEndpoint::global` | 928 | 4 | 928 | 4 | 0 | 0 |</w:t>
+      </w:r>
+    </w:p>
+    <w:p>
+      <w:pPr>
+        <w:pStyle w:val="PlainText"/>
+        <w:rPr>
+          <w:rFonts w:ascii="Courier New" w:hAnsi="Courier New" w:cs="Courier New"/>
+        </w:rPr>
+      </w:pPr>
+      <w:r>
+        <w:rPr>
+          <w:rFonts w:ascii="Courier New" w:hAnsi="Courier New" w:cs="Courier New"/>
+        </w:rPr>
+        <w:t>| 4× `Url` buffer | `url::ParseOptions::parse` | 224 | 4 | 224 | 4 | 0 | 0 |</w:t>
+      </w:r>
+    </w:p>
+    <w:p>
+      <w:pPr>
+        <w:pStyle w:val="PlainText"/>
+        <w:rPr>
+          <w:rFonts w:ascii="Courier New" w:hAnsi="Courier New" w:cs="Courier New"/>
+        </w:rPr>
+      </w:pPr>
+      <w:r>
+        <w:rPr>
+          <w:rFonts w:ascii="Courier New" w:hAnsi="Courier New" w:cs="Courier New"/>
+        </w:rPr>
+        <w:t>| 4× endpoint host:port string | `String::push_str` | 196 | 4 | 196 | 4 | 0 | 0 |</w:t>
+      </w:r>
+    </w:p>
+    <w:p>
+      <w:pPr>
+        <w:pStyle w:val="PlainText"/>
+        <w:rPr>
+          <w:rFonts w:ascii="Courier New" w:hAnsi="Courier New" w:cs="Courier New"/>
+        </w:rPr>
+      </w:pPr>
+      <w:r>
+        <w:rPr>
+          <w:rFonts w:ascii="Courier New" w:hAnsi="Courier New" w:cs="Courier New"/>
+        </w:rPr>
+        <w:t>| 1× small initial HashMap | `hashbrown::reserve_rehash` | 32 | 1 | 32 | 1 | 0 | 0 |</w:t>
+      </w:r>
+    </w:p>
+    <w:p>
+      <w:pPr>
+        <w:pStyle w:val="PlainText"/>
+        <w:rPr>
+          <w:rFonts w:ascii="Courier New" w:hAnsi="Courier New" w:cs="Courier New"/>
+        </w:rPr>
+      </w:pPr>
+      <w:r>
+        <w:rPr>
+          <w:rFonts w:ascii="Courier New" w:hAnsi="Courier New" w:cs="Courier New"/>
+        </w:rPr>
+        <w:t>| **Total at peak** | | **24,604,302** | **160,014** | **19,006,841** | **15** | **−5,597,461** | **−159,999** |</w:t>
+      </w:r>
+    </w:p>
+    <w:p>
+      <w:pPr>
+        <w:pStyle w:val="PlainText"/>
+        <w:rPr>
+          <w:rFonts w:ascii="Courier New" w:hAnsi="Courier New" w:cs="Courier New"/>
+        </w:rPr>
+      </w:pPr>
+    </w:p>
+    <w:p>
+      <w:pPr>
+        <w:pStyle w:val="PlainText"/>
+        <w:rPr>
+          <w:rFonts w:ascii="Courier New" w:hAnsi="Courier New" w:cs="Courier New"/>
+        </w:rPr>
+      </w:pPr>
+      <w:r>
+        <w:rPr>
+          <w:rFonts w:ascii="Courier New" w:hAnsi="Courier New" w:cs="Courier New"/>
+        </w:rPr>
+        <w:t>**Reading the table:**</w:t>
+      </w:r>
+    </w:p>
+    <w:p>
+      <w:pPr>
+        <w:pStyle w:val="PlainText"/>
+        <w:rPr>
+          <w:rFonts w:ascii="Courier New" w:hAnsi="Courier New" w:cs="Courier New"/>
+        </w:rPr>
+      </w:pPr>
+    </w:p>
+    <w:p>
+      <w:pPr>
+        <w:pStyle w:val="PlainText"/>
+        <w:rPr>
+          <w:rFonts w:ascii="Courier New" w:hAnsi="Courier New" w:cs="Courier New"/>
+        </w:rPr>
+      </w:pPr>
+      <w:r>
+        <w:rPr>
+          <w:rFonts w:ascii="Courier New" w:hAnsi="Courier New" w:cs="Courier New"/>
+        </w:rPr>
+        <w:t>- **Main HashMap (−1.00 MiB):** Driven entirely by the 8 B-per-slot</w:t>
+      </w:r>
+    </w:p>
+    <w:p>
+      <w:pPr>
+        <w:pStyle w:val="PlainText"/>
+        <w:rPr>
+          <w:rFonts w:ascii="Courier New" w:hAnsi="Courier New" w:cs="Courier New"/>
+        </w:rPr>
+      </w:pPr>
+      <w:r>
+        <w:rPr>
+          <w:rFonts w:ascii="Courier New" w:hAnsi="Courier New" w:cs="Courier New"/>
+        </w:rPr>
+        <w:t xml:space="preserve">  shrink of `PartitionFailoverEntry`. `131,072 × 8 = 1,048,576 B`</w:t>
+      </w:r>
+    </w:p>
+    <w:p>
+      <w:pPr>
+        <w:pStyle w:val="PlainText"/>
+        <w:rPr>
+          <w:rFonts w:ascii="Courier New" w:hAnsi="Courier New" w:cs="Courier New"/>
+        </w:rPr>
+      </w:pPr>
+      <w:r>
+        <w:rPr>
+          <w:rFonts w:ascii="Courier New" w:hAnsi="Courier New" w:cs="Courier New"/>
+        </w:rPr>
+        <w:t xml:space="preserve">  exactly — the arithmetic checks out.</w:t>
+      </w:r>
+    </w:p>
+    <w:p>
+      <w:pPr>
+        <w:pStyle w:val="PlainText"/>
+        <w:rPr>
+          <w:rFonts w:ascii="Courier New" w:hAnsi="Courier New" w:cs="Courier New"/>
+        </w:rPr>
+      </w:pPr>
+      <w:r>
+        <w:rPr>
+          <w:rFonts w:ascii="Courier New" w:hAnsi="Courier New" w:cs="Courier New"/>
+        </w:rPr>
+        <w:t>- **Per-entry HashSet (−3.97 MiB, −80 k blocks):** Eliminated outright.</w:t>
+      </w:r>
+    </w:p>
+    <w:p>
+      <w:pPr>
+        <w:pStyle w:val="PlainText"/>
+        <w:rPr>
+          <w:rFonts w:ascii="Courier New" w:hAnsi="Courier New" w:cs="Courier New"/>
+        </w:rPr>
+      </w:pPr>
+      <w:r>
+        <w:rPr>
+          <w:rFonts w:ascii="Courier New" w:hAnsi="Courier New" w:cs="Courier New"/>
+        </w:rPr>
+        <w:t xml:space="preserve">  Two failed endpoints fit inline in `SmallVec&lt;[CosmosEndpoint; 4]&gt;`</w:t>
+      </w:r>
+    </w:p>
+    <w:p>
+      <w:pPr>
+        <w:pStyle w:val="PlainText"/>
+        <w:rPr>
+          <w:rFonts w:ascii="Courier New" w:hAnsi="Courier New" w:cs="Courier New"/>
+        </w:rPr>
+      </w:pPr>
+      <w:r>
+        <w:rPr>
+          <w:rFonts w:ascii="Courier New" w:hAnsi="Courier New" w:cs="Courier New"/>
+        </w:rPr>
+        <w:t xml:space="preserve">  with no heap allocation.</w:t>
+      </w:r>
+    </w:p>
+    <w:p>
+      <w:pPr>
+        <w:pStyle w:val="PlainText"/>
+        <w:rPr>
+          <w:rFonts w:ascii="Courier New" w:hAnsi="Courier New" w:cs="Courier New"/>
+        </w:rPr>
+      </w:pPr>
+      <w:r>
+        <w:rPr>
+          <w:rFonts w:ascii="Courier New" w:hAnsi="Courier New" w:cs="Courier New"/>
+        </w:rPr>
+        <w:t>- **Per-entry String (−389 KB, ≈ −80 k blocks):** Numeric IDs of length</w:t>
+      </w:r>
+    </w:p>
+    <w:p>
+      <w:pPr>
+        <w:pStyle w:val="PlainText"/>
+        <w:rPr>
+          <w:rFonts w:ascii="Courier New" w:hAnsi="Courier New" w:cs="Courier New"/>
+        </w:rPr>
+      </w:pPr>
+      <w:r>
+        <w:rPr>
+          <w:rFonts w:ascii="Courier New" w:hAnsi="Courier New" w:cs="Courier New"/>
+        </w:rPr>
+        <w:t xml:space="preserve">  ≤ 5 fit inline in `CompactString`. The 5 B / 1 block residual is the</w:t>
+      </w:r>
+    </w:p>
+    <w:p>
+      <w:pPr>
+        <w:pStyle w:val="PlainText"/>
+        <w:rPr>
+          <w:rFonts w:ascii="Courier New" w:hAnsi="Courier New" w:cs="Courier New"/>
+        </w:rPr>
+      </w:pPr>
+      <w:r>
+        <w:rPr>
+          <w:rFonts w:ascii="Courier New" w:hAnsi="Courier New" w:cs="Courier New"/>
+        </w:rPr>
+        <w:t xml:space="preserve">  *transient* `i.to_string()` scratch from the very last iteration of</w:t>
+      </w:r>
+    </w:p>
+    <w:p>
+      <w:pPr>
+        <w:pStyle w:val="PlainText"/>
+        <w:rPr>
+          <w:rFonts w:ascii="Courier New" w:hAnsi="Courier New" w:cs="Courier New"/>
+        </w:rPr>
+      </w:pPr>
+      <w:r>
+        <w:rPr>
+          <w:rFonts w:ascii="Courier New" w:hAnsi="Courier New" w:cs="Courier New"/>
+        </w:rPr>
+        <w:t xml:space="preserve">  the example loop — it lives on the stack as a regular `String`,</w:t>
+      </w:r>
+    </w:p>
+    <w:p>
+      <w:pPr>
+        <w:pStyle w:val="PlainText"/>
+        <w:rPr>
+          <w:rFonts w:ascii="Courier New" w:hAnsi="Courier New" w:cs="Courier New"/>
+        </w:rPr>
+      </w:pPr>
+      <w:r>
+        <w:rPr>
+          <w:rFonts w:ascii="Courier New" w:hAnsi="Courier New" w:cs="Courier New"/>
+        </w:rPr>
+        <w:t xml:space="preserve">  becomes inline `CompactString` once handed to `from_str`, and is</w:t>
+      </w:r>
+    </w:p>
+    <w:p>
+      <w:pPr>
+        <w:pStyle w:val="PlainText"/>
+        <w:rPr>
+          <w:rFonts w:ascii="Courier New" w:hAnsi="Courier New" w:cs="Courier New"/>
+        </w:rPr>
+      </w:pPr>
+      <w:r>
+        <w:rPr>
+          <w:rFonts w:ascii="Courier New" w:hAnsi="Courier New" w:cs="Courier New"/>
+        </w:rPr>
+        <w:t xml:space="preserve">  freed at end-of-iteration. It just happened to be alive at the peak</w:t>
+      </w:r>
+    </w:p>
+    <w:p>
+      <w:pPr>
+        <w:pStyle w:val="PlainText"/>
+        <w:rPr>
+          <w:rFonts w:ascii="Courier New" w:hAnsi="Courier New" w:cs="Courier New"/>
+        </w:rPr>
+      </w:pPr>
+      <w:r>
+        <w:rPr>
+          <w:rFonts w:ascii="Courier New" w:hAnsi="Courier New" w:cs="Courier New"/>
+        </w:rPr>
+        <w:t xml:space="preserve">  sample. Production code never goes through `i.to_string()` — it</w:t>
+      </w:r>
+    </w:p>
+    <w:p>
+      <w:pPr>
+        <w:pStyle w:val="PlainText"/>
+        <w:rPr>
+          <w:rFonts w:ascii="Courier New" w:hAnsi="Courier New" w:cs="Courier New"/>
+        </w:rPr>
+      </w:pPr>
+      <w:r>
+        <w:rPr>
+          <w:rFonts w:ascii="Courier New" w:hAnsi="Courier New" w:cs="Courier New"/>
+        </w:rPr>
+        <w:t xml:space="preserve">  parses directly from header bytes.</w:t>
+      </w:r>
+    </w:p>
+    <w:p>
+      <w:pPr>
+        <w:pStyle w:val="PlainText"/>
+        <w:rPr>
+          <w:rFonts w:ascii="Courier New" w:hAnsi="Courier New" w:cs="Courier New"/>
+        </w:rPr>
+      </w:pPr>
+    </w:p>
+    <w:p>
+      <w:pPr>
+        <w:pStyle w:val="PlainText"/>
+        <w:rPr>
+          <w:rFonts w:ascii="Courier New" w:hAnsi="Courier New" w:cs="Courier New"/>
+        </w:rPr>
+      </w:pPr>
+      <w:r>
+        <w:rPr>
+          <w:rFonts w:ascii="Courier New" w:hAnsi="Courier New" w:cs="Courier New"/>
+        </w:rPr>
+        <w:t>### 15.6 Versus the §11.4 projection</w:t>
+      </w:r>
+    </w:p>
+    <w:p>
+      <w:pPr>
+        <w:pStyle w:val="PlainText"/>
+        <w:rPr>
+          <w:rFonts w:ascii="Courier New" w:hAnsi="Courier New" w:cs="Courier New"/>
+        </w:rPr>
+      </w:pPr>
+    </w:p>
+    <w:p>
+      <w:pPr>
+        <w:pStyle w:val="PlainText"/>
+        <w:rPr>
+          <w:rFonts w:ascii="Courier New" w:hAnsi="Courier New" w:cs="Courier New"/>
+        </w:rPr>
+      </w:pPr>
+      <w:r>
+        <w:rPr>
+          <w:rFonts w:ascii="Courier New" w:hAnsi="Courier New" w:cs="Courier New"/>
+        </w:rPr>
+        <w:t>| Metric | §11.4 projection | v2 measured | Verdict |</w:t>
+      </w:r>
+    </w:p>
+    <w:p>
+      <w:pPr>
+        <w:pStyle w:val="PlainText"/>
+        <w:rPr>
+          <w:rFonts w:ascii="Courier New" w:hAnsi="Courier New" w:cs="Courier New"/>
+        </w:rPr>
+      </w:pPr>
+      <w:r>
+        <w:rPr>
+          <w:rFonts w:ascii="Courier New" w:hAnsi="Courier New" w:cs="Courier New"/>
+        </w:rPr>
+        <w:t>|---|---:|---:|---|</w:t>
+      </w:r>
+    </w:p>
+    <w:p>
+      <w:pPr>
+        <w:pStyle w:val="PlainText"/>
+        <w:rPr>
+          <w:rFonts w:ascii="Courier New" w:hAnsi="Courier New" w:cs="Courier New"/>
+        </w:rPr>
+      </w:pPr>
+      <w:r>
+        <w:rPr>
+          <w:rFonts w:ascii="Courier New" w:hAnsi="Courier New" w:cs="Courier New"/>
+        </w:rPr>
+        <w:t>| Peak live heap | ~20,640,000 B | **19,006,841 B** | **Beat projection by 1.63 MiB** |</w:t>
+      </w:r>
+    </w:p>
+    <w:p>
+      <w:pPr>
+        <w:pStyle w:val="PlainText"/>
+        <w:rPr>
+          <w:rFonts w:ascii="Courier New" w:hAnsi="Courier New" w:cs="Courier New"/>
+        </w:rPr>
+      </w:pPr>
+      <w:r>
+        <w:rPr>
+          <w:rFonts w:ascii="Courier New" w:hAnsi="Courier New" w:cs="Courier New"/>
+        </w:rPr>
+        <w:t>| Peak live blocks | ~14 | **15** | Within 1 of projection |</w:t>
+      </w:r>
+    </w:p>
+    <w:p>
+      <w:pPr>
+        <w:pStyle w:val="PlainText"/>
+        <w:rPr>
+          <w:rFonts w:ascii="Courier New" w:hAnsi="Courier New" w:cs="Courier New"/>
+        </w:rPr>
+      </w:pPr>
+      <w:r>
+        <w:rPr>
+          <w:rFonts w:ascii="Courier New" w:hAnsi="Courier New" w:cs="Courier New"/>
+        </w:rPr>
+        <w:t>| Bytes per entry | ~258 | ~237 | **Beat projection by 21 B/entry** |</w:t>
+      </w:r>
+    </w:p>
+    <w:p>
+      <w:pPr>
+        <w:pStyle w:val="PlainText"/>
+        <w:rPr>
+          <w:rFonts w:ascii="Courier New" w:hAnsi="Courier New" w:cs="Courier New"/>
+        </w:rPr>
+      </w:pPr>
+      <w:r>
+        <w:rPr>
+          <w:rFonts w:ascii="Courier New" w:hAnsi="Courier New" w:cs="Courier New"/>
+        </w:rPr>
+        <w:t xml:space="preserve">| Blocks per entry | 0 | 0 | </w:t>
+      </w:r>
+      <w:r>
+        <w:rPr>
+          <w:rFonts w:ascii="Segoe UI Symbol" w:hAnsi="Segoe UI Symbol" w:cs="Segoe UI Symbol"/>
+        </w:rPr>
+        <w:t>✓</w:t>
+      </w:r>
+      <w:r>
+        <w:rPr>
+          <w:rFonts w:ascii="Courier New" w:hAnsi="Courier New" w:cs="Courier New"/>
+        </w:rPr>
+        <w:t xml:space="preserve"> As predicted |</w:t>
+      </w:r>
+    </w:p>
+    <w:p>
+      <w:pPr>
+        <w:pStyle w:val="PlainText"/>
+        <w:rPr>
+          <w:rFonts w:ascii="Courier New" w:hAnsi="Courier New" w:cs="Courier New"/>
+        </w:rPr>
+      </w:pPr>
+    </w:p>
+    <w:p>
+      <w:pPr>
+        <w:pStyle w:val="PlainText"/>
+        <w:rPr>
+          <w:rFonts w:ascii="Courier New" w:hAnsi="Courier New" w:cs="Courier New"/>
+        </w:rPr>
+      </w:pPr>
+      <w:r>
+        <w:rPr>
+          <w:rFonts w:ascii="Courier New" w:hAnsi="Courier New" w:cs="Courier New"/>
+        </w:rPr>
+        <w:t>The measured byte savings exceeded the projection because §11.4 did</w:t>
+      </w:r>
+    </w:p>
+    <w:p>
+      <w:pPr>
+        <w:pStyle w:val="PlainText"/>
+        <w:rPr>
+          <w:rFonts w:ascii="Courier New" w:hAnsi="Courier New" w:cs="Courier New"/>
+        </w:rPr>
+      </w:pPr>
+      <w:r>
+        <w:rPr>
+          <w:rFonts w:ascii="Courier New" w:hAnsi="Courier New" w:cs="Courier New"/>
+        </w:rPr>
+        <w:t>not anticipate that **`SmallVec&lt;[T; 4]&gt;` with the `union` feature is</w:t>
+      </w:r>
+    </w:p>
+    <w:p>
+      <w:pPr>
+        <w:pStyle w:val="PlainText"/>
+        <w:rPr>
+          <w:rFonts w:ascii="Courier New" w:hAnsi="Courier New" w:cs="Courier New"/>
+        </w:rPr>
+      </w:pPr>
+      <w:r>
+        <w:rPr>
+          <w:rFonts w:ascii="Courier New" w:hAnsi="Courier New" w:cs="Courier New"/>
+        </w:rPr>
+        <w:t>smaller than `HashSet&lt;T&gt;`** — it modelled the per-slot inline cost as</w:t>
+      </w:r>
+    </w:p>
+    <w:p>
+      <w:pPr>
+        <w:pStyle w:val="PlainText"/>
+        <w:rPr>
+          <w:rFonts w:ascii="Courier New" w:hAnsi="Courier New" w:cs="Courier New"/>
+        </w:rPr>
+      </w:pPr>
+      <w:r>
+        <w:rPr>
+          <w:rFonts w:ascii="Courier New" w:hAnsi="Courier New" w:cs="Courier New"/>
+        </w:rPr>
+        <w:t>unchanged. That single 8-byte shrink, multiplied by hashbrown's</w:t>
+      </w:r>
+    </w:p>
+    <w:p>
+      <w:pPr>
+        <w:pStyle w:val="PlainText"/>
+        <w:rPr>
+          <w:rFonts w:ascii="Courier New" w:hAnsi="Courier New" w:cs="Courier New"/>
+        </w:rPr>
+      </w:pPr>
+      <w:r>
+        <w:rPr>
+          <w:rFonts w:ascii="Courier New" w:hAnsi="Courier New" w:cs="Courier New"/>
+        </w:rPr>
+        <w:t>power-of-2 over-reservation, contributed an extra 1 MiB of savings on</w:t>
+      </w:r>
+    </w:p>
+    <w:p>
+      <w:pPr>
+        <w:pStyle w:val="PlainText"/>
+        <w:rPr>
+          <w:rFonts w:ascii="Courier New" w:hAnsi="Courier New" w:cs="Courier New"/>
+        </w:rPr>
+      </w:pPr>
+      <w:r>
+        <w:rPr>
+          <w:rFonts w:ascii="Courier New" w:hAnsi="Courier New" w:cs="Courier New"/>
+        </w:rPr>
+        <w:t>the main HashMap.</w:t>
+      </w:r>
+    </w:p>
+    <w:p>
+      <w:pPr>
+        <w:pStyle w:val="PlainText"/>
+        <w:rPr>
+          <w:rFonts w:ascii="Courier New" w:hAnsi="Courier New" w:cs="Courier New"/>
+        </w:rPr>
+      </w:pPr>
+    </w:p>
+    <w:p>
+      <w:pPr>
+        <w:pStyle w:val="PlainText"/>
+        <w:rPr>
+          <w:rFonts w:ascii="Courier New" w:hAnsi="Courier New" w:cs="Courier New"/>
+        </w:rPr>
+      </w:pPr>
+      <w:r>
+        <w:rPr>
+          <w:rFonts w:ascii="Courier New" w:hAnsi="Courier New" w:cs="Courier New"/>
+        </w:rPr>
+        <w:t>### 15.7 Re-projected scaling (v2 numbers)</w:t>
+      </w:r>
+    </w:p>
+    <w:p>
+      <w:pPr>
+        <w:pStyle w:val="PlainText"/>
+        <w:rPr>
+          <w:rFonts w:ascii="Courier New" w:hAnsi="Courier New" w:cs="Courier New"/>
+        </w:rPr>
+      </w:pPr>
+    </w:p>
+    <w:p>
+      <w:pPr>
+        <w:pStyle w:val="PlainText"/>
+        <w:rPr>
+          <w:rFonts w:ascii="Courier New" w:hAnsi="Courier New" w:cs="Courier New"/>
+        </w:rPr>
+      </w:pPr>
+      <w:r>
+        <w:rPr>
+          <w:rFonts w:ascii="Courier New" w:hAnsi="Courier New" w:cs="Courier New"/>
+        </w:rPr>
+        <w:t>Updated waypoints based on the measured `~237 B/entry` slope:</w:t>
+      </w:r>
+    </w:p>
+    <w:p>
+      <w:pPr>
+        <w:pStyle w:val="PlainText"/>
+        <w:rPr>
+          <w:rFonts w:ascii="Courier New" w:hAnsi="Courier New" w:cs="Courier New"/>
+        </w:rPr>
+      </w:pPr>
+    </w:p>
+    <w:p>
+      <w:pPr>
+        <w:pStyle w:val="PlainText"/>
+        <w:rPr>
+          <w:rFonts w:ascii="Courier New" w:hAnsi="Courier New" w:cs="Courier New"/>
+        </w:rPr>
+      </w:pPr>
+      <w:r>
+        <w:rPr>
+          <w:rFonts w:ascii="Courier New" w:hAnsi="Courier New" w:cs="Courier New"/>
+        </w:rPr>
+        <w:t>| N partitions | v1 projected peak | v2 projected peak | Improvement |</w:t>
+      </w:r>
+    </w:p>
+    <w:p>
+      <w:pPr>
+        <w:pStyle w:val="PlainText"/>
+        <w:rPr>
+          <w:rFonts w:ascii="Courier New" w:hAnsi="Courier New" w:cs="Courier New"/>
+        </w:rPr>
+      </w:pPr>
+      <w:r>
+        <w:rPr>
+          <w:rFonts w:ascii="Courier New" w:hAnsi="Courier New" w:cs="Courier New"/>
+        </w:rPr>
+        <w:t>|---:|---:|---:|---:|</w:t>
+      </w:r>
+    </w:p>
+    <w:p>
+      <w:pPr>
+        <w:pStyle w:val="PlainText"/>
+        <w:rPr>
+          <w:rFonts w:ascii="Courier New" w:hAnsi="Courier New" w:cs="Courier New"/>
+        </w:rPr>
+      </w:pPr>
+      <w:r>
+        <w:rPr>
+          <w:rFonts w:ascii="Courier New" w:hAnsi="Courier New" w:cs="Courier New"/>
+        </w:rPr>
+        <w:t>| 10,000 | ~3.0 MB | ~2.4 MB | −20 % |</w:t>
+      </w:r>
+    </w:p>
+    <w:p>
+      <w:pPr>
+        <w:pStyle w:val="PlainText"/>
+        <w:rPr>
+          <w:rFonts w:ascii="Courier New" w:hAnsi="Courier New" w:cs="Courier New"/>
+        </w:rPr>
+      </w:pPr>
+      <w:r>
+        <w:rPr>
+          <w:rFonts w:ascii="Courier New" w:hAnsi="Courier New" w:cs="Courier New"/>
+        </w:rPr>
+        <w:t>| 80,000 | 23.46 MiB (measured) | **18.13 MiB (measured)** | **−22.7 %** |</w:t>
+      </w:r>
+    </w:p>
+    <w:p>
+      <w:pPr>
+        <w:pStyle w:val="PlainText"/>
+        <w:rPr>
+          <w:rFonts w:ascii="Courier New" w:hAnsi="Courier New" w:cs="Courier New"/>
+        </w:rPr>
+      </w:pPr>
+      <w:r>
+        <w:rPr>
+          <w:rFonts w:ascii="Courier New" w:hAnsi="Courier New" w:cs="Courier New"/>
+        </w:rPr>
+        <w:t>| 100,000 | ~30 MB | ~24 MB | −20 % |</w:t>
+      </w:r>
+    </w:p>
+    <w:p>
+      <w:pPr>
+        <w:pStyle w:val="PlainText"/>
+        <w:rPr>
+          <w:rFonts w:ascii="Courier New" w:hAnsi="Courier New" w:cs="Courier New"/>
+        </w:rPr>
+      </w:pPr>
+      <w:r>
+        <w:rPr>
+          <w:rFonts w:ascii="Courier New" w:hAnsi="Courier New" w:cs="Courier New"/>
+        </w:rPr>
+        <w:t>| 131,072 | ~40 MB | ~31 MB | −22 % |</w:t>
+      </w:r>
+    </w:p>
+    <w:p>
+      <w:pPr>
+        <w:pStyle w:val="PlainText"/>
+        <w:rPr>
+          <w:rFonts w:ascii="Courier New" w:hAnsi="Courier New" w:cs="Courier New"/>
+        </w:rPr>
+      </w:pPr>
+      <w:r>
+        <w:rPr>
+          <w:rFonts w:ascii="Courier New" w:hAnsi="Courier New" w:cs="Courier New"/>
+        </w:rPr>
+        <w:t>| 1,000,000 | ~310 MB (extrapolated) | ~240 MB (extrapolated) | −22 % |</w:t>
+      </w:r>
+    </w:p>
+    <w:p>
+      <w:pPr>
+        <w:pStyle w:val="PlainText"/>
+        <w:rPr>
+          <w:rFonts w:ascii="Courier New" w:hAnsi="Courier New" w:cs="Courier New"/>
+        </w:rPr>
+      </w:pPr>
+    </w:p>
+    <w:p>
+      <w:pPr>
+        <w:pStyle w:val="PlainText"/>
+        <w:rPr>
+          <w:rFonts w:ascii="Courier New" w:hAnsi="Courier New" w:cs="Courier New"/>
+        </w:rPr>
+      </w:pPr>
+      <w:r>
+        <w:rPr>
+          <w:rFonts w:ascii="Courier New" w:hAnsi="Courier New" w:cs="Courier New"/>
+        </w:rPr>
+        <w:t>For an extreme 1 M-partition deployment, the optimization saves an</w:t>
+      </w:r>
+    </w:p>
+    <w:p>
+      <w:pPr>
+        <w:pStyle w:val="PlainText"/>
+        <w:rPr>
+          <w:rFonts w:ascii="Courier New" w:hAnsi="Courier New" w:cs="Courier New"/>
+        </w:rPr>
+      </w:pPr>
+      <w:r>
+        <w:rPr>
+          <w:rFonts w:ascii="Courier New" w:hAnsi="Courier New" w:cs="Courier New"/>
+        </w:rPr>
+        <w:t>extrapolated **~70 MB** of resident memory under fully-tripped</w:t>
+      </w:r>
+    </w:p>
+    <w:p>
+      <w:pPr>
+        <w:pStyle w:val="PlainText"/>
+        <w:rPr>
+          <w:rFonts w:ascii="Courier New" w:hAnsi="Courier New" w:cs="Courier New"/>
+        </w:rPr>
+      </w:pPr>
+      <w:r>
+        <w:rPr>
+          <w:rFonts w:ascii="Courier New" w:hAnsi="Courier New" w:cs="Courier New"/>
+        </w:rPr>
+        <w:t>worst-case PPCB load.</w:t>
+      </w:r>
+    </w:p>
+    <w:p>
+      <w:pPr>
+        <w:pStyle w:val="PlainText"/>
+        <w:rPr>
+          <w:rFonts w:ascii="Courier New" w:hAnsi="Courier New" w:cs="Courier New"/>
+        </w:rPr>
+      </w:pPr>
+    </w:p>
+    <w:p>
+      <w:pPr>
+        <w:pStyle w:val="PlainText"/>
+        <w:rPr>
+          <w:rFonts w:ascii="Courier New" w:hAnsi="Courier New" w:cs="Courier New"/>
+        </w:rPr>
+      </w:pPr>
+      <w:r>
+        <w:rPr>
+          <w:rFonts w:ascii="Courier New" w:hAnsi="Courier New" w:cs="Courier New"/>
+        </w:rPr>
+        <w:t>### 15.8 Lifetime allocation traffic</w:t>
+      </w:r>
+    </w:p>
+    <w:p>
+      <w:pPr>
+        <w:pStyle w:val="PlainText"/>
+        <w:rPr>
+          <w:rFonts w:ascii="Courier New" w:hAnsi="Courier New" w:cs="Courier New"/>
+        </w:rPr>
+      </w:pPr>
+    </w:p>
+    <w:p>
+      <w:pPr>
+        <w:pStyle w:val="PlainText"/>
+        <w:rPr>
+          <w:rFonts w:ascii="Courier New" w:hAnsi="Courier New" w:cs="Courier New"/>
+        </w:rPr>
+      </w:pPr>
+      <w:r>
+        <w:rPr>
+          <w:rFonts w:ascii="Courier New" w:hAnsi="Courier New" w:cs="Courier New"/>
+        </w:rPr>
+        <w:t>The block-count win is the more operationally interesting metric:</w:t>
+      </w:r>
+    </w:p>
+    <w:p>
+      <w:pPr>
+        <w:pStyle w:val="PlainText"/>
+        <w:rPr>
+          <w:rFonts w:ascii="Courier New" w:hAnsi="Courier New" w:cs="Courier New"/>
+        </w:rPr>
+      </w:pPr>
+    </w:p>
+    <w:p>
+      <w:pPr>
+        <w:pStyle w:val="PlainText"/>
+        <w:rPr>
+          <w:rFonts w:ascii="Courier New" w:hAnsi="Courier New" w:cs="Courier New"/>
+        </w:rPr>
+      </w:pPr>
+      <w:r>
+        <w:rPr>
+          <w:rFonts w:ascii="Courier New" w:hAnsi="Courier New" w:cs="Courier New"/>
+        </w:rPr>
+        <w:t>- **v1**: 240,026 alloc events to reach steady state — 160 k of those</w:t>
+      </w:r>
+    </w:p>
+    <w:p>
+      <w:pPr>
+        <w:pStyle w:val="PlainText"/>
+        <w:rPr>
+          <w:rFonts w:ascii="Courier New" w:hAnsi="Courier New" w:cs="Courier New"/>
+        </w:rPr>
+      </w:pPr>
+      <w:r>
+        <w:rPr>
+          <w:rFonts w:ascii="Courier New" w:hAnsi="Courier New" w:cs="Courier New"/>
+        </w:rPr>
+        <w:t xml:space="preserve">  hit the slow path through hashbrown's bucket table allocator.</w:t>
+      </w:r>
+    </w:p>
+    <w:p>
+      <w:pPr>
+        <w:pStyle w:val="PlainText"/>
+        <w:rPr>
+          <w:rFonts w:ascii="Courier New" w:hAnsi="Courier New" w:cs="Courier New"/>
+        </w:rPr>
+      </w:pPr>
+      <w:r>
+        <w:rPr>
+          <w:rFonts w:ascii="Courier New" w:hAnsi="Courier New" w:cs="Courier New"/>
+        </w:rPr>
+        <w:t>- **v2**: 80,026 alloc events — only 26 are real PPCB allocations; the</w:t>
+      </w:r>
+    </w:p>
+    <w:p>
+      <w:pPr>
+        <w:pStyle w:val="PlainText"/>
+        <w:rPr>
+          <w:rFonts w:ascii="Courier New" w:hAnsi="Courier New" w:cs="Courier New"/>
+        </w:rPr>
+      </w:pPr>
+      <w:r>
+        <w:rPr>
+          <w:rFonts w:ascii="Courier New" w:hAnsi="Courier New" w:cs="Courier New"/>
+        </w:rPr>
+        <w:t xml:space="preserve">  remaining 80,000 are the *example-only* `i.to_string()` scratches.</w:t>
+      </w:r>
+    </w:p>
+    <w:p>
+      <w:pPr>
+        <w:pStyle w:val="PlainText"/>
+        <w:rPr>
+          <w:rFonts w:ascii="Courier New" w:hAnsi="Courier New" w:cs="Courier New"/>
+        </w:rPr>
+      </w:pPr>
+      <w:r>
+        <w:rPr>
+          <w:rFonts w:ascii="Courier New" w:hAnsi="Courier New" w:cs="Courier New"/>
+        </w:rPr>
+        <w:t xml:space="preserve">  In production code (which feeds PK range IDs in from header bytes),</w:t>
+      </w:r>
+    </w:p>
+    <w:p>
+      <w:pPr>
+        <w:pStyle w:val="PlainText"/>
+        <w:rPr>
+          <w:rFonts w:ascii="Courier New" w:hAnsi="Courier New" w:cs="Courier New"/>
+        </w:rPr>
+      </w:pPr>
+      <w:r>
+        <w:rPr>
+          <w:rFonts w:ascii="Courier New" w:hAnsi="Courier New" w:cs="Courier New"/>
+        </w:rPr>
+        <w:t xml:space="preserve">  the steady-state buildup of 80 k entries would cost **~26 alloc</w:t>
+      </w:r>
+    </w:p>
+    <w:p>
+      <w:pPr>
+        <w:pStyle w:val="PlainText"/>
+        <w:rPr>
+          <w:rFonts w:ascii="Courier New" w:hAnsi="Courier New" w:cs="Courier New"/>
+        </w:rPr>
+      </w:pPr>
+      <w:r>
+        <w:rPr>
+          <w:rFonts w:ascii="Courier New" w:hAnsi="Courier New" w:cs="Courier New"/>
+        </w:rPr>
+        <w:t xml:space="preserve">  events total** — essentially constant, not linear.</w:t>
+      </w:r>
+    </w:p>
+    <w:p>
+      <w:pPr>
+        <w:pStyle w:val="PlainText"/>
+        <w:rPr>
+          <w:rFonts w:ascii="Courier New" w:hAnsi="Courier New" w:cs="Courier New"/>
+        </w:rPr>
+      </w:pPr>
+    </w:p>
+    <w:p>
+      <w:pPr>
+        <w:pStyle w:val="PlainText"/>
+        <w:rPr>
+          <w:rFonts w:ascii="Courier New" w:hAnsi="Courier New" w:cs="Courier New"/>
+        </w:rPr>
+      </w:pPr>
+      <w:r>
+        <w:rPr>
+          <w:rFonts w:ascii="Courier New" w:hAnsi="Courier New" w:cs="Courier New"/>
+        </w:rPr>
+        <w:t>This is the qualitative shift the §11 recommendations were aiming</w:t>
+      </w:r>
+    </w:p>
+    <w:p>
+      <w:pPr>
+        <w:pStyle w:val="PlainText"/>
+        <w:rPr>
+          <w:rFonts w:ascii="Courier New" w:hAnsi="Courier New" w:cs="Courier New"/>
+        </w:rPr>
+      </w:pPr>
+      <w:r>
+        <w:rPr>
+          <w:rFonts w:ascii="Courier New" w:hAnsi="Courier New" w:cs="Courier New"/>
+        </w:rPr>
+        <w:t>for: PPCB no longer puts allocator-contention pressure on the system</w:t>
+      </w:r>
+    </w:p>
+    <w:p>
+      <w:pPr>
+        <w:pStyle w:val="PlainText"/>
+        <w:rPr>
+          <w:rFonts w:ascii="Courier New" w:hAnsi="Courier New" w:cs="Courier New"/>
+        </w:rPr>
+      </w:pPr>
+      <w:r>
+        <w:rPr>
+          <w:rFonts w:ascii="Courier New" w:hAnsi="Courier New" w:cs="Courier New"/>
+        </w:rPr>
+        <w:t>during a partition-event storm.</w:t>
+      </w:r>
+    </w:p>
+    <w:p>
+      <w:pPr>
+        <w:pStyle w:val="PlainText"/>
+        <w:rPr>
+          <w:rFonts w:ascii="Courier New" w:hAnsi="Courier New" w:cs="Courier New"/>
+        </w:rPr>
+      </w:pPr>
+    </w:p>
+    <w:p>
+      <w:pPr>
+        <w:pStyle w:val="PlainText"/>
+        <w:rPr>
+          <w:rFonts w:ascii="Courier New" w:hAnsi="Courier New" w:cs="Courier New"/>
+        </w:rPr>
+      </w:pPr>
+      <w:r>
+        <w:rPr>
+          <w:rFonts w:ascii="Courier New" w:hAnsi="Courier New" w:cs="Courier New"/>
+        </w:rPr>
+        <w:t>### 15.9 Behavioural correctness</w:t>
+      </w:r>
+    </w:p>
+    <w:p>
+      <w:pPr>
+        <w:pStyle w:val="PlainText"/>
+        <w:rPr>
+          <w:rFonts w:ascii="Courier New" w:hAnsi="Courier New" w:cs="Courier New"/>
+        </w:rPr>
+      </w:pPr>
+    </w:p>
+    <w:p>
+      <w:pPr>
+        <w:pStyle w:val="PlainText"/>
+        <w:rPr>
+          <w:rFonts w:ascii="Courier New" w:hAnsi="Courier New" w:cs="Courier New"/>
+        </w:rPr>
+      </w:pPr>
+      <w:r>
+        <w:rPr>
+          <w:rFonts w:ascii="Courier New" w:hAnsi="Courier New" w:cs="Courier New"/>
+        </w:rPr>
+        <w:t>Behavioural changes worth noting:</w:t>
+      </w:r>
+    </w:p>
+    <w:p>
+      <w:pPr>
+        <w:pStyle w:val="PlainText"/>
+        <w:rPr>
+          <w:rFonts w:ascii="Courier New" w:hAnsi="Courier New" w:cs="Courier New"/>
+        </w:rPr>
+      </w:pPr>
+    </w:p>
+    <w:p>
+      <w:pPr>
+        <w:pStyle w:val="PlainText"/>
+        <w:rPr>
+          <w:rFonts w:ascii="Courier New" w:hAnsi="Courier New" w:cs="Courier New"/>
+        </w:rPr>
+      </w:pPr>
+      <w:r>
+        <w:rPr>
+          <w:rFonts w:ascii="Courier New" w:hAnsi="Courier New" w:cs="Courier New"/>
+        </w:rPr>
+        <w:t>- `try_move_next_endpoint` now uses linear `contains()` instead of</w:t>
+      </w:r>
+    </w:p>
+    <w:p>
+      <w:pPr>
+        <w:pStyle w:val="PlainText"/>
+        <w:rPr>
+          <w:rFonts w:ascii="Courier New" w:hAnsi="Courier New" w:cs="Courier New"/>
+        </w:rPr>
+      </w:pPr>
+      <w:r>
+        <w:rPr>
+          <w:rFonts w:ascii="Courier New" w:hAnsi="Courier New" w:cs="Courier New"/>
+        </w:rPr>
+        <w:t xml:space="preserve">  hash lookup when checking whether `failed_endpoint` was already</w:t>
+      </w:r>
+    </w:p>
+    <w:p>
+      <w:pPr>
+        <w:pStyle w:val="PlainText"/>
+        <w:rPr>
+          <w:rFonts w:ascii="Courier New" w:hAnsi="Courier New" w:cs="Courier New"/>
+        </w:rPr>
+      </w:pPr>
+      <w:r>
+        <w:rPr>
+          <w:rFonts w:ascii="Courier New" w:hAnsi="Courier New" w:cs="Courier New"/>
+        </w:rPr>
+        <w:t xml:space="preserve">  recorded. For `K ≤ 4` this is equivalent or faster (no hash</w:t>
+      </w:r>
+    </w:p>
+    <w:p>
+      <w:pPr>
+        <w:pStyle w:val="PlainText"/>
+        <w:rPr>
+          <w:rFonts w:ascii="Courier New" w:hAnsi="Courier New" w:cs="Courier New"/>
+        </w:rPr>
+      </w:pPr>
+      <w:r>
+        <w:rPr>
+          <w:rFonts w:ascii="Courier New" w:hAnsi="Courier New" w:cs="Courier New"/>
+        </w:rPr>
+        <w:t xml:space="preserve">  computation, all elements fit in a single cache line).</w:t>
+      </w:r>
+    </w:p>
+    <w:p>
+      <w:pPr>
+        <w:pStyle w:val="PlainText"/>
+        <w:rPr>
+          <w:rFonts w:ascii="Courier New" w:hAnsi="Courier New" w:cs="Courier New"/>
+        </w:rPr>
+      </w:pPr>
+      <w:r>
+        <w:rPr>
+          <w:rFonts w:ascii="Courier New" w:hAnsi="Courier New" w:cs="Courier New"/>
+        </w:rPr>
+        <w:t>- The `failed_endpoints` field no longer enforces uniqueness</w:t>
+      </w:r>
+    </w:p>
+    <w:p>
+      <w:pPr>
+        <w:pStyle w:val="PlainText"/>
+        <w:rPr>
+          <w:rFonts w:ascii="Courier New" w:hAnsi="Courier New" w:cs="Courier New"/>
+        </w:rPr>
+      </w:pPr>
+      <w:r>
+        <w:rPr>
+          <w:rFonts w:ascii="Courier New" w:hAnsi="Courier New" w:cs="Courier New"/>
+        </w:rPr>
+        <w:t xml:space="preserve">  automatically — the `if !contains { push }` guard in</w:t>
+      </w:r>
+    </w:p>
+    <w:p>
+      <w:pPr>
+        <w:pStyle w:val="PlainText"/>
+        <w:rPr>
+          <w:rFonts w:ascii="Courier New" w:hAnsi="Courier New" w:cs="Courier New"/>
+        </w:rPr>
+      </w:pPr>
+      <w:r>
+        <w:rPr>
+          <w:rFonts w:ascii="Courier New" w:hAnsi="Courier New" w:cs="Courier New"/>
+        </w:rPr>
+        <w:t xml:space="preserve">  `try_move_next_endpoint` is now load-bearing. A regression test</w:t>
+      </w:r>
+    </w:p>
+    <w:p>
+      <w:pPr>
+        <w:pStyle w:val="PlainText"/>
+        <w:rPr>
+          <w:rFonts w:ascii="Courier New" w:hAnsi="Courier New" w:cs="Courier New"/>
+        </w:rPr>
+      </w:pPr>
+      <w:r>
+        <w:rPr>
+          <w:rFonts w:ascii="Courier New" w:hAnsi="Courier New" w:cs="Courier New"/>
+        </w:rPr>
+        <w:t xml:space="preserve">  could be added in a follow-up to lock this in (the existing</w:t>
+      </w:r>
+    </w:p>
+    <w:p>
+      <w:pPr>
+        <w:pStyle w:val="PlainText"/>
+        <w:rPr>
+          <w:rFonts w:ascii="Courier New" w:hAnsi="Courier New" w:cs="Courier New"/>
+        </w:rPr>
+      </w:pPr>
+      <w:r>
+        <w:rPr>
+          <w:rFonts w:ascii="Courier New" w:hAnsi="Courier New" w:cs="Courier New"/>
+        </w:rPr>
+        <w:t xml:space="preserve">  `mark_partition_unavailable_all_endpoints_exhausted_removes_entry`</w:t>
+      </w:r>
+    </w:p>
+    <w:p>
+      <w:pPr>
+        <w:pStyle w:val="PlainText"/>
+        <w:rPr>
+          <w:rFonts w:ascii="Courier New" w:hAnsi="Courier New" w:cs="Courier New"/>
+        </w:rPr>
+      </w:pPr>
+      <w:r>
+        <w:rPr>
+          <w:rFonts w:ascii="Courier New" w:hAnsi="Courier New" w:cs="Courier New"/>
+        </w:rPr>
+        <w:t xml:space="preserve">  test does exercise the relevant path indirectly and continues to</w:t>
+      </w:r>
+    </w:p>
+    <w:p>
+      <w:pPr>
+        <w:pStyle w:val="PlainText"/>
+        <w:rPr>
+          <w:rFonts w:ascii="Courier New" w:hAnsi="Courier New" w:cs="Courier New"/>
+        </w:rPr>
+      </w:pPr>
+      <w:r>
+        <w:rPr>
+          <w:rFonts w:ascii="Courier New" w:hAnsi="Courier New" w:cs="Courier New"/>
+        </w:rPr>
+        <w:t xml:space="preserve">  pass).</w:t>
+      </w:r>
+    </w:p>
+    <w:p>
+      <w:pPr>
+        <w:pStyle w:val="PlainText"/>
+        <w:rPr>
+          <w:rFonts w:ascii="Courier New" w:hAnsi="Courier New" w:cs="Courier New"/>
+        </w:rPr>
+      </w:pPr>
+      <w:r>
+        <w:rPr>
+          <w:rFonts w:ascii="Courier New" w:hAnsi="Courier New" w:cs="Courier New"/>
+        </w:rPr>
+        <w:t>- All public type signatures are unchanged from the consumer's point</w:t>
+      </w:r>
+    </w:p>
+    <w:p>
+      <w:pPr>
+        <w:pStyle w:val="PlainText"/>
+        <w:rPr>
+          <w:rFonts w:ascii="Courier New" w:hAnsi="Courier New" w:cs="Courier New"/>
+        </w:rPr>
+      </w:pPr>
+      <w:r>
+        <w:rPr>
+          <w:rFonts w:ascii="Courier New" w:hAnsi="Courier New" w:cs="Courier New"/>
+        </w:rPr>
+        <w:t xml:space="preserve">  of view: `PartitionKeyRangeId::as_str()` still returns `&amp;str`,</w:t>
+      </w:r>
+    </w:p>
+    <w:p>
+      <w:pPr>
+        <w:pStyle w:val="PlainText"/>
+        <w:rPr>
+          <w:rFonts w:ascii="Courier New" w:hAnsi="Courier New" w:cs="Courier New"/>
+        </w:rPr>
+      </w:pPr>
+      <w:r>
+        <w:rPr>
+          <w:rFonts w:ascii="Courier New" w:hAnsi="Courier New" w:cs="Courier New"/>
+        </w:rPr>
+        <w:t xml:space="preserve">  `Display` / `From&lt;String&gt;` / `From&lt;&amp;str&gt;` / `Borrow&lt;str&gt;` /</w:t>
+      </w:r>
+    </w:p>
+    <w:p>
+      <w:pPr>
+        <w:pStyle w:val="PlainText"/>
+        <w:rPr>
+          <w:rFonts w:ascii="Courier New" w:hAnsi="Courier New" w:cs="Courier New"/>
+        </w:rPr>
+      </w:pPr>
+      <w:r>
+        <w:rPr>
+          <w:rFonts w:ascii="Courier New" w:hAnsi="Courier New" w:cs="Courier New"/>
+        </w:rPr>
+        <w:t xml:space="preserve">  `Hash` / `Eq` all behave identically.</w:t>
+      </w:r>
+    </w:p>
+    <w:p>
+      <w:pPr>
+        <w:pStyle w:val="PlainText"/>
+        <w:rPr>
+          <w:rFonts w:ascii="Courier New" w:hAnsi="Courier New" w:cs="Courier New"/>
+        </w:rPr>
+      </w:pPr>
+    </w:p>
+    <w:p>
+      <w:pPr>
+        <w:pStyle w:val="PlainText"/>
+        <w:rPr>
+          <w:rFonts w:ascii="Courier New" w:hAnsi="Courier New" w:cs="Courier New"/>
+        </w:rPr>
+      </w:pPr>
+      <w:r>
+        <w:rPr>
+          <w:rFonts w:ascii="Courier New" w:hAnsi="Courier New" w:cs="Courier New"/>
+        </w:rPr>
+        <w:t>### 15.10 Files touched (final)</w:t>
+      </w:r>
+    </w:p>
+    <w:p>
+      <w:pPr>
+        <w:pStyle w:val="PlainText"/>
+        <w:rPr>
+          <w:rFonts w:ascii="Courier New" w:hAnsi="Courier New" w:cs="Courier New"/>
+        </w:rPr>
+      </w:pPr>
+    </w:p>
+    <w:p>
+      <w:pPr>
+        <w:pStyle w:val="PlainText"/>
+        <w:rPr>
+          <w:rFonts w:ascii="Courier New" w:hAnsi="Courier New" w:cs="Courier New"/>
+        </w:rPr>
+      </w:pPr>
+      <w:r>
+        <w:rPr>
+          <w:rFonts w:ascii="Courier New" w:hAnsi="Courier New" w:cs="Courier New"/>
+        </w:rPr>
+        <w:t>```</w:t>
+      </w:r>
+    </w:p>
+    <w:p>
+      <w:pPr>
+        <w:pStyle w:val="PlainText"/>
+        <w:rPr>
+          <w:rFonts w:ascii="Courier New" w:hAnsi="Courier New" w:cs="Courier New"/>
+        </w:rPr>
+      </w:pPr>
+      <w:r>
+        <w:rPr>
+          <w:rFonts w:ascii="Courier New" w:hAnsi="Courier New" w:cs="Courier New"/>
+        </w:rPr>
+        <w:t>sdk/cosmos/Cargo.toml                                            (workspace deps)</w:t>
+      </w:r>
+    </w:p>
+    <w:p>
+      <w:pPr>
+        <w:pStyle w:val="PlainText"/>
+        <w:rPr>
+          <w:rFonts w:ascii="Courier New" w:hAnsi="Courier New" w:cs="Courier New"/>
+        </w:rPr>
+      </w:pPr>
+      <w:r>
+        <w:rPr>
+          <w:rFonts w:ascii="Courier New" w:hAnsi="Courier New" w:cs="Courier New"/>
+        </w:rPr>
+        <w:t>Cargo.toml                                                        (workspace deps - root)</w:t>
+      </w:r>
+    </w:p>
+    <w:p>
+      <w:pPr>
+        <w:pStyle w:val="PlainText"/>
+        <w:rPr>
+          <w:rFonts w:ascii="Courier New" w:hAnsi="Courier New" w:cs="Courier New"/>
+        </w:rPr>
+      </w:pPr>
+      <w:r>
+        <w:rPr>
+          <w:rFonts w:ascii="Courier New" w:hAnsi="Courier New" w:cs="Courier New"/>
+        </w:rPr>
+        <w:t>sdk/cosmos/azure_data_cosmos_driver/Cargo.toml                   (driver deps)</w:t>
+      </w:r>
+    </w:p>
+    <w:p>
+      <w:pPr>
+        <w:pStyle w:val="PlainText"/>
+        <w:rPr>
+          <w:rFonts w:ascii="Courier New" w:hAnsi="Courier New" w:cs="Courier New"/>
+        </w:rPr>
+      </w:pPr>
+      <w:r>
+        <w:rPr>
+          <w:rFonts w:ascii="Courier New" w:hAnsi="Courier New" w:cs="Courier New"/>
+        </w:rPr>
+        <w:t>sdk/cosmos/azure_data_cosmos_driver/src/driver/routing/</w:t>
+      </w:r>
+    </w:p>
+    <w:p>
+      <w:pPr>
+        <w:pStyle w:val="PlainText"/>
+        <w:rPr>
+          <w:rFonts w:ascii="Courier New" w:hAnsi="Courier New" w:cs="Courier New"/>
+        </w:rPr>
+      </w:pPr>
+      <w:r>
+        <w:rPr>
+          <w:rFonts w:ascii="Courier New" w:hAnsi="Courier New" w:cs="Courier New"/>
+        </w:rPr>
+        <w:t xml:space="preserve">    partition_endpoint_state.rs                                  (FailedEndpoints alias)</w:t>
+      </w:r>
+    </w:p>
+    <w:p>
+      <w:pPr>
+        <w:pStyle w:val="PlainText"/>
+        <w:rPr>
+          <w:rFonts w:ascii="Courier New" w:hAnsi="Courier New" w:cs="Courier New"/>
+        </w:rPr>
+      </w:pPr>
+      <w:r>
+        <w:rPr>
+          <w:rFonts w:ascii="Courier New" w:hAnsi="Courier New" w:cs="Courier New"/>
+        </w:rPr>
+        <w:t xml:space="preserve">    partition_key_range_id.rs                                    (CompactString swap)</w:t>
+      </w:r>
+    </w:p>
+    <w:p>
+      <w:pPr>
+        <w:pStyle w:val="PlainText"/>
+        <w:rPr>
+          <w:rFonts w:ascii="Courier New" w:hAnsi="Courier New" w:cs="Courier New"/>
+        </w:rPr>
+      </w:pPr>
+      <w:r>
+        <w:rPr>
+          <w:rFonts w:ascii="Courier New" w:hAnsi="Courier New" w:cs="Courier New"/>
+        </w:rPr>
+        <w:t xml:space="preserve">    routing_systems.rs                                           (push/contains + test fixups)</w:t>
+      </w:r>
+    </w:p>
+    <w:p>
+      <w:pPr>
+        <w:pStyle w:val="PlainText"/>
+        <w:rPr>
+          <w:rFonts w:ascii="Courier New" w:hAnsi="Courier New" w:cs="Courier New"/>
+        </w:rPr>
+      </w:pPr>
+      <w:r>
+        <w:rPr>
+          <w:rFonts w:ascii="Courier New" w:hAnsi="Courier New" w:cs="Courier New"/>
+        </w:rPr>
+        <w:t>sdk/cosmos/azure_data_cosmos_driver/src/testing.rs               (FailedEndpoints re-export)</w:t>
+      </w:r>
+    </w:p>
+    <w:p>
+      <w:pPr>
+        <w:pStyle w:val="PlainText"/>
+        <w:rPr>
+          <w:rFonts w:ascii="Courier New" w:hAnsi="Courier New" w:cs="Courier New"/>
+        </w:rPr>
+      </w:pPr>
+      <w:r>
+        <w:rPr>
+          <w:rFonts w:ascii="Courier New" w:hAnsi="Courier New" w:cs="Courier New"/>
+        </w:rPr>
+        <w:t>sdk/cosmos/azure_data_cosmos_benchmarks/examples/</w:t>
+      </w:r>
+    </w:p>
+    <w:p>
+      <w:pPr>
+        <w:pStyle w:val="PlainText"/>
+        <w:rPr>
+          <w:rFonts w:ascii="Courier New" w:hAnsi="Courier New" w:cs="Courier New"/>
+        </w:rPr>
+      </w:pPr>
+      <w:r>
+        <w:rPr>
+          <w:rFonts w:ascii="Courier New" w:hAnsi="Courier New" w:cs="Courier New"/>
+        </w:rPr>
+        <w:t xml:space="preserve">    ppcb_state_dhat.rs                                           (use FailedEndpoints)</w:t>
+      </w:r>
+    </w:p>
+    <w:p>
+      <w:pPr>
+        <w:pStyle w:val="PlainText"/>
+        <w:rPr>
+          <w:rFonts w:ascii="Courier New" w:hAnsi="Courier New" w:cs="Courier New"/>
+        </w:rPr>
+      </w:pPr>
+      <w:r>
+        <w:rPr>
+          <w:rFonts w:ascii="Courier New" w:hAnsi="Courier New" w:cs="Courier New"/>
+        </w:rPr>
+        <w:t>```</w:t>
+      </w:r>
+    </w:p>
+    <w:p>
+      <w:pPr>
+        <w:pStyle w:val="PlainText"/>
+        <w:rPr>
+          <w:rFonts w:ascii="Courier New" w:hAnsi="Courier New" w:cs="Courier New"/>
+        </w:rPr>
+      </w:pPr>
+    </w:p>
+    <w:p>
+      <w:pPr>
+        <w:pStyle w:val="PlainText"/>
+        <w:rPr>
+          <w:rFonts w:ascii="Courier New" w:hAnsi="Courier New" w:cs="Courier New"/>
+        </w:rPr>
+      </w:pPr>
+      <w:r>
+        <w:rPr>
+          <w:rFonts w:ascii="Courier New" w:hAnsi="Courier New" w:cs="Courier New"/>
+        </w:rPr>
+        <w:t>### 15.11 Conclusion</w:t>
+      </w:r>
+    </w:p>
+    <w:p>
+      <w:pPr>
+        <w:pStyle w:val="PlainText"/>
+        <w:rPr>
+          <w:rFonts w:ascii="Courier New" w:hAnsi="Courier New" w:cs="Courier New"/>
+        </w:rPr>
+      </w:pPr>
+    </w:p>
+    <w:p>
+      <w:pPr>
+        <w:pStyle w:val="PlainText"/>
+        <w:rPr>
+          <w:rFonts w:ascii="Courier New" w:hAnsi="Courier New" w:cs="Courier New"/>
+        </w:rPr>
+      </w:pPr>
+      <w:r>
+        <w:rPr>
+          <w:rFonts w:ascii="Courier New" w:hAnsi="Courier New" w:cs="Courier New"/>
+        </w:rPr>
+        <w:t>Both §11.1 and §11.2 recommendations delivered as predicted, with one</w:t>
+      </w:r>
+    </w:p>
+    <w:p>
+      <w:pPr>
+        <w:pStyle w:val="PlainText"/>
+        <w:rPr>
+          <w:rFonts w:ascii="Courier New" w:hAnsi="Courier New" w:cs="Courier New"/>
+        </w:rPr>
+      </w:pPr>
+      <w:r>
+        <w:rPr>
+          <w:rFonts w:ascii="Courier New" w:hAnsi="Courier New" w:cs="Courier New"/>
+        </w:rPr>
+        <w:t>pleasant surprise (`SmallVec union` shrank `PartitionFailoverEntry`</w:t>
+      </w:r>
+    </w:p>
+    <w:p>
+      <w:pPr>
+        <w:pStyle w:val="PlainText"/>
+        <w:rPr>
+          <w:rFonts w:ascii="Courier New" w:hAnsi="Courier New" w:cs="Courier New"/>
+        </w:rPr>
+      </w:pPr>
+      <w:r>
+        <w:rPr>
+          <w:rFonts w:ascii="Courier New" w:hAnsi="Courier New" w:cs="Courier New"/>
+        </w:rPr>
+        <w:t>below `HashSet`'s footprint, contributing an unplanned 1 MiB of</w:t>
+      </w:r>
+    </w:p>
+    <w:p>
+      <w:pPr>
+        <w:pStyle w:val="PlainText"/>
+        <w:rPr>
+          <w:rFonts w:ascii="Courier New" w:hAnsi="Courier New" w:cs="Courier New"/>
+        </w:rPr>
+      </w:pPr>
+      <w:r>
+        <w:rPr>
+          <w:rFonts w:ascii="Courier New" w:hAnsi="Courier New" w:cs="Courier New"/>
+        </w:rPr>
+        <w:t>savings on the main HashMap). The optimization is now **shipped** in</w:t>
+      </w:r>
+    </w:p>
+    <w:p>
+      <w:pPr>
+        <w:pStyle w:val="PlainText"/>
+        <w:rPr>
+          <w:rFonts w:ascii="Courier New" w:hAnsi="Courier New" w:cs="Courier New"/>
+        </w:rPr>
+      </w:pPr>
+      <w:r>
+        <w:rPr>
+          <w:rFonts w:ascii="Courier New" w:hAnsi="Courier New" w:cs="Courier New"/>
+        </w:rPr>
+        <w:t>the driver. §11.3 (boxing the HashMap value) remains unimplemented</w:t>
+      </w:r>
+    </w:p>
+    <w:p>
+      <w:pPr>
+        <w:pStyle w:val="PlainText"/>
+        <w:rPr>
+          <w:rFonts w:ascii="Courier New" w:hAnsi="Courier New" w:cs="Courier New"/>
+        </w:rPr>
+      </w:pPr>
+      <w:r>
+        <w:rPr>
+          <w:rFonts w:ascii="Courier New" w:hAnsi="Courier New" w:cs="Courier New"/>
+        </w:rPr>
+        <w:t>and should only be revisited if production telemetry shows the single</w:t>
+      </w:r>
+    </w:p>
+    <w:p>
+      <w:pPr>
+        <w:pStyle w:val="PlainText"/>
+        <w:rPr>
+          <w:rFonts w:ascii="Courier New" w:hAnsi="Courier New" w:cs="Courier New"/>
+        </w:rPr>
+      </w:pPr>
+      <w:r>
+        <w:rPr>
+          <w:rFonts w:ascii="Courier New" w:hAnsi="Courier New" w:cs="Courier New"/>
+        </w:rPr>
+        <w:t>~19 MiB contiguous allocation causing problems on fragmented</w:t>
+      </w:r>
+    </w:p>
+    <w:p>
+      <w:pPr>
+        <w:pStyle w:val="PlainText"/>
+        <w:rPr>
+          <w:rFonts w:ascii="Courier New" w:hAnsi="Courier New" w:cs="Courier New"/>
+        </w:rPr>
+      </w:pPr>
+      <w:r>
+        <w:rPr>
+          <w:rFonts w:ascii="Courier New" w:hAnsi="Courier New" w:cs="Courier New"/>
+        </w:rPr>
+        <w:t>allocators.</w:t>
+      </w:r>
     </w:p>
     <w:p>
       <w:pPr>
@@ -10133,7 +12694,7 @@
     <w:link w:val="PlainTextChar"/>
     <w:uiPriority w:val="99"/>
     <w:unhideWhenUsed/>
-    <w:rsid w:val="00250344"/>
+    <w:rsid w:val="00816D3D"/>
     <w:pPr>
       <w:spacing w:after="0" w:line="240" w:lineRule="auto"/>
     </w:pPr>
@@ -10148,7 +12709,7 @@
     <w:basedOn w:val="DefaultParagraphFont"/>
     <w:link w:val="PlainText"/>
     <w:uiPriority w:val="99"/>
-    <w:rsid w:val="00250344"/>
+    <w:rsid w:val="00816D3D"/>
     <w:rPr>
       <w:rFonts w:ascii="Consolas" w:hAnsi="Consolas"/>
       <w:sz w:val="21"/>

</xml_diff>